<commit_message>
S4-03: write individual report from the two supplied product archives
</commit_message>
<xml_diff>
--- a/Sản phẩm yêu cầu/Lê Hoàng Lâm/Báo cáo sản phẩm cá nhân Sprint 4.docx
+++ b/Sản phẩm yêu cầu/Lê Hoàng Lâm/Báo cáo sản phẩm cá nhân Sprint 4.docx
@@ -34,7 +34,7 @@
         <w:rPr>
           <w:b w:val="0"/>
         </w:rPr>
-        <w:t>Sprint 4: 16/10–20/10/2026; ngày lập bản nháp: 19/10/2026.</w:t>
+        <w:t>Sprint 4: 16/10–20/10/2026; ngày tổng hợp: 19/10/2026.</w:t>
       </w:r>
     </w:p>
     <w:p>
@@ -50,7 +50,7 @@
         <w:rPr>
           <w:b/>
         </w:rPr>
-        <w:t>BẢN NHÁP – CHƯA ĐỦ ĐIỀU KIỆN NỘP</w:t>
+        <w:t>Phạm vi và nguồn báo cáo</w:t>
       </w:r>
     </w:p>
     <w:p>
@@ -58,7 +58,7 @@
         <w:rPr>
           <w:b w:val="0"/>
         </w:rPr>
-        <w:t>Chưa nhận được mẫu 06 nên tên 8 mục dưới đây là vị trí tạm, không khẳng định trùng mẫu chính thức. Chưa có sản phẩm S4-L1/S4-L3, phiếu kiểm thử ký xác nhận, commit cá nhân trên repository nhóm và lịch sử bình luận Trello. Không tự tạo nội dung hoặc giờ thực hiện cho các phần này.</w:t>
+        <w:t>Báo cáo được tổng hợp từ hai gói tonkho-lam.zip và WebsiteBanSach-S4-L4.zip do người thực hiện cung cấp. Nội dung có bằng chứng gồm sản phẩm CSDL/Model/kết nối S4-L2 và chức năng thêm sách S4-L4; báo cáo phân biệt sản phẩm nguồn, kết quả kiểm thử tự động và những thông tin chưa có trong hồ sơ.</w:t>
       </w:r>
     </w:p>
     <w:p>
@@ -66,7 +66,15 @@
         <w:rPr>
           <w:b w:val="0"/>
         </w:rPr>
-        <w:t>Năm ý mô tả mỗi hình trong bản nháp tạm dùng: tên/thẻ; mục đích; nội dung; cách thực hiện; kết quả/bằng chứng. Cần đối chiếu cách ghi chính xác trong mẫu 06.</w:t>
+        <w:t>Bố cục gồm 8 mục theo phạm vi được giao; các mục 1, 2, 3, 7 ghi Không phụ trách. Hai gói không chứa mẫu 06, nên tên các mục được đặt theo nội dung tương ứng, không coi là bản sao tên mục của mẫu chính thức.</w:t>
+      </w:r>
+    </w:p>
+    <w:p>
+      <w:r>
+        <w:rPr>
+          <w:b w:val="0"/>
+        </w:rPr>
+        <w:t>Mỗi hình được giải thích theo 5 ý: tên và thẻ; mục đích; nội dung; cách thực hiện; kết quả và bằng chứng.</w:t>
       </w:r>
     </w:p>
     <w:tbl>
@@ -120,7 +128,7 @@
               <w:rPr>
                 <w:sz w:val="22"/>
               </w:rPr>
-              <w:t>Trạng thái</w:t>
+              <w:t>Sản phẩm trình bày</w:t>
             </w:r>
           </w:p>
         </w:tc>
@@ -161,7 +169,7 @@
               <w:rPr>
                 <w:sz w:val="22"/>
               </w:rPr>
-              <w:t>Chờ tên mục theo mẫu 06</w:t>
+              <w:t>Không trình bày sản phẩm của thành viên khác</w:t>
             </w:r>
           </w:p>
         </w:tc>
@@ -202,7 +210,7 @@
               <w:rPr>
                 <w:sz w:val="22"/>
               </w:rPr>
-              <w:t>Chờ sơ đồ/sản phẩm gốc</w:t>
+              <w:t>Ghi rõ phạm vi hồ sơ được cung cấp</w:t>
             </w:r>
           </w:p>
         </w:tc>
@@ -243,7 +251,7 @@
               <w:rPr>
                 <w:sz w:val="22"/>
               </w:rPr>
-              <w:t>Chờ đặc tả/màn hình gốc</w:t>
+              <w:t>Ghi rõ phạm vi hồ sơ được cung cấp</w:t>
             </w:r>
           </w:p>
         </w:tc>
@@ -284,7 +292,7 @@
               <w:rPr>
                 <w:sz w:val="22"/>
               </w:rPr>
-              <w:t>Có bản thảo dựa trên mã và kết quả kiểm tra</w:t>
+              <w:t>CSDL, Model, kết nối, code thêm sách và bằng chứng kiểm thử</w:t>
             </w:r>
           </w:p>
         </w:tc>
@@ -325,7 +333,7 @@
               <w:rPr>
                 <w:sz w:val="22"/>
               </w:rPr>
-              <w:t>Chưa có giờ đối chiếu Trello</w:t>
+              <w:t>Trình tự thực hiện, phối hợp, khó khăn và sử dụng AI</w:t>
             </w:r>
           </w:p>
         </w:tc>
@@ -342,7 +350,7 @@
         <w:pStyle w:val="Heading1"/>
       </w:pPr>
       <w:r>
-        <w:t>1. [Tên mục theo mẫu 06 – chờ bổ sung]</w:t>
+        <w:t>1. Mục 1</w:t>
       </w:r>
     </w:p>
     <w:p>
@@ -358,7 +366,7 @@
         <w:pStyle w:val="Heading1"/>
       </w:pPr>
       <w:r>
-        <w:t>2. [Tên mục theo mẫu 06 – chờ bổ sung]</w:t>
+        <w:t>2. Mục 2</w:t>
       </w:r>
     </w:p>
     <w:p>
@@ -374,7 +382,7 @@
         <w:pStyle w:val="Heading1"/>
       </w:pPr>
       <w:r>
-        <w:t>3. [Tên mục theo mẫu 06 – chờ bổ sung]</w:t>
+        <w:t>3. Mục 3</w:t>
       </w:r>
     </w:p>
     <w:p>
@@ -390,7 +398,7 @@
         <w:pStyle w:val="Heading1"/>
       </w:pPr>
       <w:r>
-        <w:t>4. Sản phẩm S4-L1 [chờ tên mục theo mẫu 06]</w:t>
+        <w:t>4. Sản phẩm thẻ S4-L1</w:t>
       </w:r>
     </w:p>
     <w:p>
@@ -398,171 +406,7 @@
         <w:rPr>
           <w:b w:val="0"/>
         </w:rPr>
-        <w:t>Phụ trách: Lê Hoàng Lâm. Chưa có mô tả thẻ S4-L1 và tệp sơ đồ/sản phẩm trong hồ sơ đã cung cấp. Không thay thế bằng sơ đồ tự suy đoán hoặc sản phẩm của thành viên khác.</w:t>
-      </w:r>
-    </w:p>
-    <w:tbl>
-      <w:tblPr>
-        <w:tblStyle w:val="TableGrid"/>
-        <w:tblW w:type="auto" w:w="0"/>
-        <w:jc w:val="center"/>
-        <w:tblLook w:firstColumn="1" w:firstRow="1" w:lastColumn="0" w:lastRow="0" w:noHBand="0" w:noVBand="1" w:val="04A0"/>
-      </w:tblPr>
-      <w:tblGrid>
-        <w:gridCol w:w="4677"/>
-        <w:gridCol w:w="4677"/>
-      </w:tblGrid>
-      <w:tr>
-        <w:trPr>
-          <w:tblHeader/>
-        </w:trPr>
-        <w:tc>
-          <w:tcPr>
-            <w:tcW w:type="dxa" w:w="4677"/>
-          </w:tcPr>
-          <w:p>
-            <w:r>
-              <w:rPr>
-                <w:sz w:val="22"/>
-              </w:rPr>
-              <w:t>Nội dung cần bổ sung</w:t>
-            </w:r>
-          </w:p>
-        </w:tc>
-        <w:tc>
-          <w:tcPr>
-            <w:tcW w:type="dxa" w:w="4677"/>
-          </w:tcPr>
-          <w:p>
-            <w:r>
-              <w:rPr>
-                <w:sz w:val="22"/>
-              </w:rPr>
-              <w:t>Nguồn cần có</w:t>
-            </w:r>
-          </w:p>
-        </w:tc>
-      </w:tr>
-      <w:tr>
-        <w:tc>
-          <w:tcPr>
-            <w:tcW w:type="dxa" w:w="4677"/>
-          </w:tcPr>
-          <w:p>
-            <w:r>
-              <w:rPr>
-                <w:sz w:val="22"/>
-              </w:rPr>
-              <w:t>Tên và mục tiêu thẻ, phạm vi thực hiện</w:t>
-            </w:r>
-          </w:p>
-        </w:tc>
-        <w:tc>
-          <w:tcPr>
-            <w:tcW w:type="dxa" w:w="4677"/>
-          </w:tcPr>
-          <w:p>
-            <w:r>
-              <w:rPr>
-                <w:sz w:val="22"/>
-              </w:rPr>
-              <w:t>Mô tả/link S4-L1 trên Trello</w:t>
-            </w:r>
-          </w:p>
-        </w:tc>
-      </w:tr>
-      <w:tr>
-        <w:tc>
-          <w:tcPr>
-            <w:tcW w:type="dxa" w:w="4677"/>
-          </w:tcPr>
-          <w:p>
-            <w:r>
-              <w:rPr>
-                <w:sz w:val="22"/>
-              </w:rPr>
-              <w:t>Sản phẩm chính và từng hình</w:t>
-            </w:r>
-          </w:p>
-        </w:tc>
-        <w:tc>
-          <w:tcPr>
-            <w:tcW w:type="dxa" w:w="4677"/>
-          </w:tcPr>
-          <w:p>
-            <w:r>
-              <w:rPr>
-                <w:sz w:val="22"/>
-              </w:rPr>
-              <w:t>Tệp sơ đồ gốc/ảnh xuất từ sản phẩm của Lâm</w:t>
-            </w:r>
-          </w:p>
-        </w:tc>
-      </w:tr>
-      <w:tr>
-        <w:tc>
-          <w:tcPr>
-            <w:tcW w:type="dxa" w:w="4677"/>
-          </w:tcPr>
-          <w:p>
-            <w:r>
-              <w:rPr>
-                <w:sz w:val="22"/>
-              </w:rPr>
-              <w:t>Năm ý cho mỗi hình</w:t>
-            </w:r>
-          </w:p>
-        </w:tc>
-        <w:tc>
-          <w:tcPr>
-            <w:tcW w:type="dxa" w:w="4677"/>
-          </w:tcPr>
-          <w:p>
-            <w:r>
-              <w:rPr>
-                <w:sz w:val="22"/>
-              </w:rPr>
-              <w:t>Quy định mẫu 06 và nội dung sản phẩm thực tế</w:t>
-            </w:r>
-          </w:p>
-        </w:tc>
-      </w:tr>
-      <w:tr>
-        <w:tc>
-          <w:tcPr>
-            <w:tcW w:type="dxa" w:w="4677"/>
-          </w:tcPr>
-          <w:p>
-            <w:r>
-              <w:rPr>
-                <w:sz w:val="22"/>
-              </w:rPr>
-              <w:t>Kết quả rà soát/chỉnh sửa</w:t>
-            </w:r>
-          </w:p>
-        </w:tc>
-        <w:tc>
-          <w:tcPr>
-            <w:tcW w:type="dxa" w:w="4677"/>
-          </w:tcPr>
-          <w:p>
-            <w:r>
-              <w:rPr>
-                <w:sz w:val="22"/>
-              </w:rPr>
-              <w:t>Bình luận người kiểm tra và bản sửa</w:t>
-            </w:r>
-          </w:p>
-        </w:tc>
-      </w:tr>
-    </w:tbl>
-    <w:p/>
-    <w:p>
-      <w:pPr>
-        <w:pStyle w:val="Heading1"/>
-      </w:pPr>
-      <w:r>
-        <w:t>5. Sản phẩm S4-L3 [chờ tên mục theo mẫu 06]</w:t>
+        <w:t>Theo phân công, S4-L1 thuộc phần việc của Lê Hoàng Lâm. Tuy nhiên, hai gói đầu vào không có mô tả thẻ hoặc sản phẩm sơ đồ mang mã S4-L1. Vì vậy, báo cáo không chèn sơ đồ tự suy đoán và không sử dụng sản phẩm của thành viên khác để thay thế phần việc này.</w:t>
       </w:r>
     </w:p>
     <w:p>
@@ -570,7 +414,15 @@
         <w:rPr>
           <w:b w:val="0"/>
         </w:rPr>
-        <w:t>Phụ trách: Lê Hoàng Lâm. Chưa có sản phẩm S4-L3 để trình bày chính xác. Nhật ký của nhóm trưởng có nhắc việc cập nhật đặc tả UC12, nhưng đây không thay thế tệp đặc tả đã được Lâm hoàn thiện hoặc phiếu kiểm tra.</w:t>
+        <w:t>Trạng thái hồ sơ: chưa có sản phẩm S4-L1 để trích dẫn trong phạm vi hai gói được cung cấp. Đây là thẻ được phân công, không phải mục Không phụ trách.</w:t>
+      </w:r>
+    </w:p>
+    <w:p>
+      <w:pPr>
+        <w:pStyle w:val="Heading1"/>
+      </w:pPr>
+      <w:r>
+        <w:t>5. Sản phẩm thẻ S4-L3</w:t>
       </w:r>
     </w:p>
     <w:p>
@@ -578,7 +430,15 @@
         <w:rPr>
           <w:b w:val="0"/>
         </w:rPr>
-        <w:t>Cần bổ sung: mô tả thẻ, bảng đặc tả/màn hình được giao, các hình minh họa kèm 5 ý, kết quả kiểm tra và link sản phẩm/commit nếu có.</w:t>
+        <w:t>Theo phân công, S4-L3 thuộc phần việc của Lê Hoàng Lâm. Trong hai gói không có tệp đặc tả hoặc bản vẽ màn hình được xác định là sản phẩm S4-L3. Các View Razor và ảnh kiểm thử thêm sách được trình bày ở mục 6 với đúng nguồn S4-L4, không dùng để chứng minh đã hoàn thành S4-L3.</w:t>
+      </w:r>
+    </w:p>
+    <w:p>
+      <w:r>
+        <w:rPr>
+          <w:b w:val="0"/>
+        </w:rPr>
+        <w:t>Trạng thái hồ sơ: chưa có sản phẩm S4-L3 để trích dẫn trong phạm vi hai gói được cung cấp. Báo cáo không xác nhận kết quả rà soát hoặc trạng thái Pass của thẻ này.</w:t>
       </w:r>
     </w:p>
     <w:p>
@@ -586,7 +446,7 @@
         <w:pStyle w:val="Heading1"/>
       </w:pPr>
       <w:r>
-        <w:t>6. Sản phẩm S4-L2 và S4-L4 [chờ tên mục theo mẫu 06]</w:t>
+        <w:t>6. Sản phẩm CSDL, lập trình và kiểm thử – S4-L2, S4-L4</w:t>
       </w:r>
     </w:p>
     <w:p>
@@ -2178,7 +2038,7 @@
         <w:pStyle w:val="Heading1"/>
       </w:pPr>
       <w:r>
-        <w:t>7. [Tên mục theo mẫu 06 – chờ bổ sung]</w:t>
+        <w:t>7. Mục 7</w:t>
       </w:r>
     </w:p>
     <w:p>
@@ -2194,7 +2054,15 @@
         <w:pStyle w:val="Heading1"/>
       </w:pPr>
       <w:r>
-        <w:t>8. Quá trình thực hiện [chờ tên mục theo mẫu 06]</w:t>
+        <w:t>8. Quá trình thực hiện</w:t>
+      </w:r>
+    </w:p>
+    <w:p>
+      <w:pPr>
+        <w:pStyle w:val="Heading2"/>
+      </w:pPr>
+      <w:r>
+        <w:t>8.1. Tiếp nhận và đối chiếu đầu vào</w:t>
       </w:r>
     </w:p>
     <w:p>
@@ -2202,7 +2070,23 @@
         <w:rPr>
           <w:b w:val="0"/>
         </w:rPr>
-        <w:t>Nguyên tắc ghi nhận: giờ dự kiến, giờ bắt đầu/kết thúc và thời lượng phải lấy từ bình luận của chính các thẻ hoặc nguồn nhóm xác nhận. Không lấy thời gian commit của AI hay thời gian tạo file để thay giờ làm của Lâm.</w:t>
+        <w:t>Đầu vào gồm gói tonkho-lam.zip chứa bản tham khảo, S4-L2 v3, tài liệu nghiệp vụ và các script hỗ trợ; gói WebsiteBanSach-S4-L4.zip chứa bản mã nguồn đã tích hợp trên master, nhật ký AI, log và ảnh kiểm thử. Hai gói được kiểm tra lại trước khi lập báo cáo. Gói S4-L4 được xác nhận có cùng SHA-256 với bản bàn giao đã đưa lên kho tải tệp.</w:t>
+      </w:r>
+    </w:p>
+    <w:p>
+      <w:r>
+        <w:rPr>
+          <w:b w:val="0"/>
+        </w:rPr>
+        <w:t>Trong quá trình hỗ trợ trước khi đóng gói, mã tham khảo được phân biệt với master nhóm. Các chức năng sửa/chi tiết/duyệt/ẩn/xóa/khôi phục sẵn có được giữ nguyên, chỉ thay đổi những điểm nối cần để thêm sách hoạt động đúng.</w:t>
+      </w:r>
+    </w:p>
+    <w:p>
+      <w:pPr>
+        <w:pStyle w:val="Heading2"/>
+      </w:pPr>
+      <w:r>
+        <w:t>8.2. Các bước thực hiện và sản phẩm đầu ra</w:t>
       </w:r>
     </w:p>
     <w:tbl>
@@ -2213,10 +2097,9 @@
         <w:tblLook w:firstColumn="1" w:firstRow="1" w:lastColumn="0" w:lastRow="0" w:noHBand="0" w:noVBand="1" w:val="04A0"/>
       </w:tblPr>
       <w:tblGrid>
-        <w:gridCol w:w="2339"/>
-        <w:gridCol w:w="2339"/>
-        <w:gridCol w:w="2339"/>
-        <w:gridCol w:w="2339"/>
+        <w:gridCol w:w="3118"/>
+        <w:gridCol w:w="3118"/>
+        <w:gridCol w:w="3118"/>
       </w:tblGrid>
       <w:tr>
         <w:trPr>
@@ -2224,7 +2107,409 @@
         </w:trPr>
         <w:tc>
           <w:tcPr>
-            <w:tcW w:type="dxa" w:w="2339"/>
+            <w:tcW w:type="dxa" w:w="3118"/>
+          </w:tcPr>
+          <w:p>
+            <w:r>
+              <w:rPr>
+                <w:sz w:val="22"/>
+              </w:rPr>
+              <w:t>Bước</w:t>
+            </w:r>
+          </w:p>
+        </w:tc>
+        <w:tc>
+          <w:tcPr>
+            <w:tcW w:type="dxa" w:w="3118"/>
+          </w:tcPr>
+          <w:p>
+            <w:r>
+              <w:rPr>
+                <w:sz w:val="22"/>
+              </w:rPr>
+              <w:t>Công việc đã có bằng chứng</w:t>
+            </w:r>
+          </w:p>
+        </w:tc>
+        <w:tc>
+          <w:tcPr>
+            <w:tcW w:type="dxa" w:w="3118"/>
+          </w:tcPr>
+          <w:p>
+            <w:r>
+              <w:rPr>
+                <w:sz w:val="22"/>
+              </w:rPr>
+              <w:t>Đầu ra</w:t>
+            </w:r>
+          </w:p>
+        </w:tc>
+      </w:tr>
+      <w:tr>
+        <w:tc>
+          <w:tcPr>
+            <w:tcW w:type="dxa" w:w="3118"/>
+          </w:tcPr>
+          <w:p>
+            <w:r>
+              <w:rPr>
+                <w:sz w:val="22"/>
+              </w:rPr>
+              <w:t>1</w:t>
+            </w:r>
+          </w:p>
+        </w:tc>
+        <w:tc>
+          <w:tcPr>
+            <w:tcW w:type="dxa" w:w="3118"/>
+          </w:tcPr>
+          <w:p>
+            <w:r>
+              <w:rPr>
+                <w:sz w:val="22"/>
+              </w:rPr>
+              <w:t>Đọc schema, Model, kết nối và quy tắc TC10–TC13</w:t>
+            </w:r>
+          </w:p>
+        </w:tc>
+        <w:tc>
+          <w:tcPr>
+            <w:tcW w:type="dxa" w:w="3118"/>
+          </w:tcPr>
+          <w:p>
+            <w:r>
+              <w:rPr>
+                <w:sz w:val="22"/>
+              </w:rPr>
+              <w:t>Xác định dữ liệu, điều kiện hợp lệ và chống trùng cả bộ</w:t>
+            </w:r>
+          </w:p>
+        </w:tc>
+      </w:tr>
+      <w:tr>
+        <w:tc>
+          <w:tcPr>
+            <w:tcW w:type="dxa" w:w="3118"/>
+          </w:tcPr>
+          <w:p>
+            <w:r>
+              <w:rPr>
+                <w:sz w:val="22"/>
+              </w:rPr>
+              <w:t>2</w:t>
+            </w:r>
+          </w:p>
+        </w:tc>
+        <w:tc>
+          <w:tcPr>
+            <w:tcW w:type="dxa" w:w="3118"/>
+          </w:tcPr>
+          <w:p>
+            <w:r>
+              <w:rPr>
+                <w:sz w:val="22"/>
+              </w:rPr>
+              <w:t>Đối chiếu biểu mẫu thêm/sửa và tách phần _BieuMau</w:t>
+            </w:r>
+          </w:p>
+        </w:tc>
+        <w:tc>
+          <w:tcPr>
+            <w:tcW w:type="dxa" w:w="3118"/>
+          </w:tcPr>
+          <w:p>
+            <w:r>
+              <w:rPr>
+                <w:sz w:val="22"/>
+              </w:rPr>
+              <w:t>Biểu mẫu chung có lỗi từng trường, nhiều tác giả và ảnh</w:t>
+            </w:r>
+          </w:p>
+        </w:tc>
+      </w:tr>
+      <w:tr>
+        <w:tc>
+          <w:tcPr>
+            <w:tcW w:type="dxa" w:w="3118"/>
+          </w:tcPr>
+          <w:p>
+            <w:r>
+              <w:rPr>
+                <w:sz w:val="22"/>
+              </w:rPr>
+              <w:t>3</w:t>
+            </w:r>
+          </w:p>
+        </w:tc>
+        <w:tc>
+          <w:tcPr>
+            <w:tcW w:type="dxa" w:w="3118"/>
+          </w:tcPr>
+          <w:p>
+            <w:r>
+              <w:rPr>
+                <w:sz w:val="22"/>
+              </w:rPr>
+              <w:t>Ghép Them GET/POST vào master dùng Session</w:t>
+            </w:r>
+          </w:p>
+        </w:tc>
+        <w:tc>
+          <w:tcPr>
+            <w:tcW w:type="dxa" w:w="3118"/>
+          </w:tcPr>
+          <w:p>
+            <w:r>
+              <w:rPr>
+                <w:sz w:val="22"/>
+              </w:rPr>
+              <w:t>Sách nhân viên chờ duyệt, quản lý đang bán, không tin mã/trạng thái client</w:t>
+            </w:r>
+          </w:p>
+        </w:tc>
+      </w:tr>
+      <w:tr>
+        <w:tc>
+          <w:tcPr>
+            <w:tcW w:type="dxa" w:w="3118"/>
+          </w:tcPr>
+          <w:p>
+            <w:r>
+              <w:rPr>
+                <w:sz w:val="22"/>
+              </w:rPr>
+              <w:t>4</w:t>
+            </w:r>
+          </w:p>
+        </w:tc>
+        <w:tc>
+          <w:tcPr>
+            <w:tcW w:type="dxa" w:w="3118"/>
+          </w:tcPr>
+          <w:p>
+            <w:r>
+              <w:rPr>
+                <w:sz w:val="22"/>
+              </w:rPr>
+              <w:t>Sửa điểm nối đổi vai và danh sách</w:t>
+            </w:r>
+          </w:p>
+        </w:tc>
+        <w:tc>
+          <w:tcPr>
+            <w:tcW w:type="dxa" w:w="3118"/>
+          </w:tcPr>
+          <w:p>
+            <w:r>
+              <w:rPr>
+                <w:sz w:val="22"/>
+              </w:rPr>
+              <w:t>Nút ghi Session thật; sách mới đầu trang 1, tô sáng</w:t>
+            </w:r>
+          </w:p>
+        </w:tc>
+      </w:tr>
+      <w:tr>
+        <w:tc>
+          <w:tcPr>
+            <w:tcW w:type="dxa" w:w="3118"/>
+          </w:tcPr>
+          <w:p>
+            <w:r>
+              <w:rPr>
+                <w:sz w:val="22"/>
+              </w:rPr>
+              <w:t>5</w:t>
+            </w:r>
+          </w:p>
+        </w:tc>
+        <w:tc>
+          <w:tcPr>
+            <w:tcW w:type="dxa" w:w="3118"/>
+          </w:tcPr>
+          <w:p>
+            <w:r>
+              <w:rPr>
+                <w:sz w:val="22"/>
+              </w:rPr>
+              <w:t>Build Release và chạy kiểm thử HTTP</w:t>
+            </w:r>
+          </w:p>
+        </w:tc>
+        <w:tc>
+          <w:tcPr>
+            <w:tcW w:type="dxa" w:w="3118"/>
+          </w:tcPr>
+          <w:p>
+            <w:r>
+              <w:rPr>
+                <w:sz w:val="22"/>
+              </w:rPr>
+              <w:t>0 lỗi build; 38 kiểm tra HTTP qua bằng EF InMemory</w:t>
+            </w:r>
+          </w:p>
+        </w:tc>
+      </w:tr>
+      <w:tr>
+        <w:tc>
+          <w:tcPr>
+            <w:tcW w:type="dxa" w:w="3118"/>
+          </w:tcPr>
+          <w:p>
+            <w:r>
+              <w:rPr>
+                <w:sz w:val="22"/>
+              </w:rPr>
+              <w:t>6</w:t>
+            </w:r>
+          </w:p>
+        </w:tc>
+        <w:tc>
+          <w:tcPr>
+            <w:tcW w:type="dxa" w:w="3118"/>
+          </w:tcPr>
+          <w:p>
+            <w:r>
+              <w:rPr>
+                <w:sz w:val="22"/>
+              </w:rPr>
+              <w:t>Chạy Chromium desktop/mobile</w:t>
+            </w:r>
+          </w:p>
+        </w:tc>
+        <w:tc>
+          <w:tcPr>
+            <w:tcW w:type="dxa" w:w="3118"/>
+          </w:tcPr>
+          <w:p>
+            <w:r>
+              <w:rPr>
+                <w:sz w:val="22"/>
+              </w:rPr>
+              <w:t>10 kiểm tra qua, ảnh minh họa TC10–TC13</w:t>
+            </w:r>
+          </w:p>
+        </w:tc>
+      </w:tr>
+      <w:tr>
+        <w:tc>
+          <w:tcPr>
+            <w:tcW w:type="dxa" w:w="3118"/>
+          </w:tcPr>
+          <w:p>
+            <w:r>
+              <w:rPr>
+                <w:sz w:val="22"/>
+              </w:rPr>
+              <w:t>7</w:t>
+            </w:r>
+          </w:p>
+        </w:tc>
+        <w:tc>
+          <w:tcPr>
+            <w:tcW w:type="dxa" w:w="3118"/>
+          </w:tcPr>
+          <w:p>
+            <w:r>
+              <w:rPr>
+                <w:sz w:val="22"/>
+              </w:rPr>
+              <w:t>Ghi nhật ký, hướng dẫn và đóng gói</w:t>
+            </w:r>
+          </w:p>
+        </w:tc>
+        <w:tc>
+          <w:tcPr>
+            <w:tcW w:type="dxa" w:w="3118"/>
+          </w:tcPr>
+          <w:p>
+            <w:r>
+              <w:rPr>
+                <w:sz w:val="22"/>
+              </w:rPr>
+              <w:t>ZIP mã nguồn, patch, bằng chứng và log AI</w:t>
+            </w:r>
+          </w:p>
+        </w:tc>
+      </w:tr>
+      <w:tr>
+        <w:tc>
+          <w:tcPr>
+            <w:tcW w:type="dxa" w:w="3118"/>
+          </w:tcPr>
+          <w:p>
+            <w:r>
+              <w:rPr>
+                <w:sz w:val="22"/>
+              </w:rPr>
+              <w:t>8</w:t>
+            </w:r>
+          </w:p>
+        </w:tc>
+        <w:tc>
+          <w:tcPr>
+            <w:tcW w:type="dxa" w:w="3118"/>
+          </w:tcPr>
+          <w:p>
+            <w:r>
+              <w:rPr>
+                <w:sz w:val="22"/>
+              </w:rPr>
+              <w:t>Bàn giao qua kho đã được cấp quyền</w:t>
+            </w:r>
+          </w:p>
+        </w:tc>
+        <w:tc>
+          <w:tcPr>
+            <w:tcW w:type="dxa" w:w="3118"/>
+          </w:tcPr>
+          <w:p>
+            <w:r>
+              <w:rPr>
+                <w:sz w:val="22"/>
+              </w:rPr>
+              <w:t>ZIP ở nhánh ban-giao-s4-l4-20261019 của bom-NO2/chat_gpt</w:t>
+            </w:r>
+          </w:p>
+        </w:tc>
+      </w:tr>
+    </w:tbl>
+    <w:p/>
+    <w:p>
+      <w:pPr>
+        <w:pStyle w:val="Heading2"/>
+      </w:pPr>
+      <w:r>
+        <w:t>8.3. Thời gian và theo dõi thẻ</w:t>
+      </w:r>
+    </w:p>
+    <w:p>
+      <w:r>
+        <w:rPr>
+          <w:b w:val="0"/>
+        </w:rPr>
+        <w:t>Ngày tổng hợp báo cáo: 19/10/2026. Hai gói không có bình luận Trello ghi giờ bắt đầu, giờ kết thúc hoặc thời lượng làm từng thẻ. Do đó, báo cáo ghi theo trình tự công việc và không điền giờ ước đoán. Ngày tạo tệp hoặc timestamp commit của công cụ không được sử dụng thay giờ thực hiện cá nhân trên Trello.</w:t>
+      </w:r>
+    </w:p>
+    <w:tbl>
+      <w:tblPr>
+        <w:tblStyle w:val="TableGrid"/>
+        <w:tblW w:type="auto" w:w="0"/>
+        <w:jc w:val="center"/>
+        <w:tblLook w:firstColumn="1" w:firstRow="1" w:lastColumn="0" w:lastRow="0" w:noHBand="0" w:noVBand="1" w:val="04A0"/>
+      </w:tblPr>
+      <w:tblGrid>
+        <w:gridCol w:w="3118"/>
+        <w:gridCol w:w="3118"/>
+        <w:gridCol w:w="3118"/>
+      </w:tblGrid>
+      <w:tr>
+        <w:trPr>
+          <w:tblHeader/>
+        </w:trPr>
+        <w:tc>
+          <w:tcPr>
+            <w:tcW w:type="dxa" w:w="3118"/>
           </w:tcPr>
           <w:p>
             <w:r>
@@ -2237,40 +2522,27 @@
         </w:tc>
         <w:tc>
           <w:tcPr>
-            <w:tcW w:type="dxa" w:w="2339"/>
+            <w:tcW w:type="dxa" w:w="3118"/>
           </w:tcPr>
           <w:p>
             <w:r>
               <w:rPr>
                 <w:sz w:val="22"/>
               </w:rPr>
-              <w:t>Công việc/sản phẩm</w:t>
+              <w:t>Căn cứ quá trình trong hai gói</w:t>
             </w:r>
           </w:p>
         </w:tc>
         <w:tc>
           <w:tcPr>
-            <w:tcW w:type="dxa" w:w="2339"/>
+            <w:tcW w:type="dxa" w:w="3118"/>
           </w:tcPr>
           <w:p>
             <w:r>
               <w:rPr>
                 <w:sz w:val="22"/>
               </w:rPr>
-              <w:t>Giờ bắt đầu – kết thúc theo Trello</w:t>
-            </w:r>
-          </w:p>
-        </w:tc>
-        <w:tc>
-          <w:tcPr>
-            <w:tcW w:type="dxa" w:w="2339"/>
-          </w:tcPr>
-          <w:p>
-            <w:r>
-              <w:rPr>
-                <w:sz w:val="22"/>
-              </w:rPr>
-              <w:t>Đối chiếu</w:t>
+              <w:t>Giờ đối chiếu Trello</w:t>
             </w:r>
           </w:p>
         </w:tc>
@@ -2278,7 +2550,7 @@
       <w:tr>
         <w:tc>
           <w:tcPr>
-            <w:tcW w:type="dxa" w:w="2339"/>
+            <w:tcW w:type="dxa" w:w="3118"/>
           </w:tcPr>
           <w:p>
             <w:r>
@@ -2291,40 +2563,27 @@
         </w:tc>
         <w:tc>
           <w:tcPr>
-            <w:tcW w:type="dxa" w:w="2339"/>
+            <w:tcW w:type="dxa" w:w="3118"/>
           </w:tcPr>
           <w:p>
             <w:r>
               <w:rPr>
                 <w:sz w:val="22"/>
               </w:rPr>
-              <w:t>Chờ sản phẩm sơ đồ và mô tả thẻ</w:t>
+              <w:t>Không có sản phẩm nguồn của thẻ</w:t>
             </w:r>
           </w:p>
         </w:tc>
         <w:tc>
           <w:tcPr>
-            <w:tcW w:type="dxa" w:w="2339"/>
+            <w:tcW w:type="dxa" w:w="3118"/>
           </w:tcPr>
           <w:p>
             <w:r>
               <w:rPr>
                 <w:sz w:val="22"/>
               </w:rPr>
-              <w:t>[Chưa cung cấp]</w:t>
-            </w:r>
-          </w:p>
-        </w:tc>
-        <w:tc>
-          <w:tcPr>
-            <w:tcW w:type="dxa" w:w="2339"/>
-          </w:tcPr>
-          <w:p>
-            <w:r>
-              <w:rPr>
-                <w:sz w:val="22"/>
-              </w:rPr>
-              <w:t>Chưa đối chiếu</w:t>
+              <w:t>Không có dữ liệu</w:t>
             </w:r>
           </w:p>
         </w:tc>
@@ -2332,7 +2591,7 @@
       <w:tr>
         <w:tc>
           <w:tcPr>
-            <w:tcW w:type="dxa" w:w="2339"/>
+            <w:tcW w:type="dxa" w:w="3118"/>
           </w:tcPr>
           <w:p>
             <w:r>
@@ -2345,40 +2604,27 @@
         </w:tc>
         <w:tc>
           <w:tcPr>
-            <w:tcW w:type="dxa" w:w="2339"/>
+            <w:tcW w:type="dxa" w:w="3118"/>
           </w:tcPr>
           <w:p>
             <w:r>
               <w:rPr>
                 <w:sz w:val="22"/>
               </w:rPr>
-              <w:t>Chờ đặc tả/màn hình và phiên bản cuối</w:t>
+              <w:t>Không có sản phẩm nguồn của thẻ</w:t>
             </w:r>
           </w:p>
         </w:tc>
         <w:tc>
           <w:tcPr>
-            <w:tcW w:type="dxa" w:w="2339"/>
+            <w:tcW w:type="dxa" w:w="3118"/>
           </w:tcPr>
           <w:p>
             <w:r>
               <w:rPr>
                 <w:sz w:val="22"/>
               </w:rPr>
-              <w:t>[Chưa cung cấp]</w:t>
-            </w:r>
-          </w:p>
-        </w:tc>
-        <w:tc>
-          <w:tcPr>
-            <w:tcW w:type="dxa" w:w="2339"/>
-          </w:tcPr>
-          <w:p>
-            <w:r>
-              <w:rPr>
-                <w:sz w:val="22"/>
-              </w:rPr>
-              <w:t>Chưa đối chiếu</w:t>
+              <w:t>Không có dữ liệu</w:t>
             </w:r>
           </w:p>
         </w:tc>
@@ -2386,7 +2632,7 @@
       <w:tr>
         <w:tc>
           <w:tcPr>
-            <w:tcW w:type="dxa" w:w="2339"/>
+            <w:tcW w:type="dxa" w:w="3118"/>
           </w:tcPr>
           <w:p>
             <w:r>
@@ -2399,40 +2645,27 @@
         </w:tc>
         <w:tc>
           <w:tcPr>
-            <w:tcW w:type="dxa" w:w="2339"/>
+            <w:tcW w:type="dxa" w:w="3118"/>
           </w:tcPr>
           <w:p>
             <w:r>
               <w:rPr>
                 <w:sz w:val="22"/>
               </w:rPr>
-              <w:t>Script, Model, kết nối; có gói v3</w:t>
+              <w:t>README, changelog v3 và lam-s4-l2.md</w:t>
             </w:r>
           </w:p>
         </w:tc>
         <w:tc>
           <w:tcPr>
-            <w:tcW w:type="dxa" w:w="2339"/>
+            <w:tcW w:type="dxa" w:w="3118"/>
           </w:tcPr>
           <w:p>
             <w:r>
               <w:rPr>
                 <w:sz w:val="22"/>
               </w:rPr>
-              <w:t>[Chưa cung cấp]</w:t>
-            </w:r>
-          </w:p>
-        </w:tc>
-        <w:tc>
-          <w:tcPr>
-            <w:tcW w:type="dxa" w:w="2339"/>
-          </w:tcPr>
-          <w:p>
-            <w:r>
-              <w:rPr>
-                <w:sz w:val="22"/>
-              </w:rPr>
-              <w:t>Chưa có link commit/phiếu kiểm tra</w:t>
+              <w:t>Không có dữ liệu</w:t>
             </w:r>
           </w:p>
         </w:tc>
@@ -2440,7 +2673,7 @@
       <w:tr>
         <w:tc>
           <w:tcPr>
-            <w:tcW w:type="dxa" w:w="2339"/>
+            <w:tcW w:type="dxa" w:w="3118"/>
           </w:tcPr>
           <w:p>
             <w:r>
@@ -2453,40 +2686,27 @@
         </w:tc>
         <w:tc>
           <w:tcPr>
-            <w:tcW w:type="dxa" w:w="2339"/>
+            <w:tcW w:type="dxa" w:w="3118"/>
           </w:tcPr>
           <w:p>
             <w:r>
               <w:rPr>
                 <w:sz w:val="22"/>
               </w:rPr>
-              <w:t>Code tích hợp, test, ảnh và bàn giao ZIP</w:t>
+              <w:t>lam-s4-l4.md, log build/HTTP/browser và ảnh</w:t>
             </w:r>
           </w:p>
         </w:tc>
         <w:tc>
           <w:tcPr>
-            <w:tcW w:type="dxa" w:w="2339"/>
+            <w:tcW w:type="dxa" w:w="3118"/>
           </w:tcPr>
           <w:p>
             <w:r>
               <w:rPr>
                 <w:sz w:val="22"/>
               </w:rPr>
-              <w:t>[Chưa cung cấp]</w:t>
-            </w:r>
-          </w:p>
-        </w:tc>
-        <w:tc>
-          <w:tcPr>
-            <w:tcW w:type="dxa" w:w="2339"/>
-          </w:tcPr>
-          <w:p>
-            <w:r>
-              <w:rPr>
-                <w:sz w:val="22"/>
-              </w:rPr>
-              <w:t>Có bằng chứng phiên AI; chưa có giờ thẻ</w:t>
+              <w:t>Không có dữ liệu</w:t>
             </w:r>
           </w:p>
         </w:tc>
@@ -2494,7 +2714,7 @@
       <w:tr>
         <w:tc>
           <w:tcPr>
-            <w:tcW w:type="dxa" w:w="2339"/>
+            <w:tcW w:type="dxa" w:w="3118"/>
           </w:tcPr>
           <w:p>
             <w:r>
@@ -2507,40 +2727,319 @@
         </w:tc>
         <w:tc>
           <w:tcPr>
-            <w:tcW w:type="dxa" w:w="2339"/>
+            <w:tcW w:type="dxa" w:w="3118"/>
           </w:tcPr>
           <w:p>
             <w:r>
               <w:rPr>
                 <w:sz w:val="22"/>
               </w:rPr>
-              <w:t>Soạn báo cáo cá nhân theo mẫu 06</w:t>
+              <w:t>Nhật ký soạn báo cáo lam-s4-03.md</w:t>
             </w:r>
           </w:p>
         </w:tc>
         <w:tc>
           <w:tcPr>
-            <w:tcW w:type="dxa" w:w="2339"/>
+            <w:tcW w:type="dxa" w:w="3118"/>
           </w:tcPr>
           <w:p>
             <w:r>
               <w:rPr>
                 <w:sz w:val="22"/>
               </w:rPr>
-              <w:t>[Chưa cung cấp]</w:t>
+              <w:t>Không có dữ liệu</w:t>
             </w:r>
           </w:p>
         </w:tc>
+      </w:tr>
+    </w:tbl>
+    <w:p/>
+    <w:p>
+      <w:pPr>
+        <w:pStyle w:val="Heading2"/>
+      </w:pPr>
+      <w:r>
+        <w:t>8.4. Khó khăn, xử lý và phối hợp</w:t>
+      </w:r>
+    </w:p>
+    <w:p>
+      <w:r>
+        <w:rPr>
+          <w:b w:val="0"/>
+        </w:rPr>
+        <w:t>Khác biệt mã nguồn: bản tham khảo dùng cookie, master dùng Session. Khi tích hợp, chức năng thêm và bộ kiểm thử được điều chỉnh theo Session để khớp hệ thống hiện tại. File controller đổi vai ban đầu không có đuôi .cs; nút giao diện chỉ đổi localStorage nên chưa tác động quyền server. Hai điểm này đã được sửa và kiểm tra bằng HTTP/Chromium.</w:t>
+      </w:r>
+    </w:p>
+    <w:p>
+      <w:r>
+        <w:rPr>
+          <w:b w:val="0"/>
+        </w:rPr>
+        <w:t>Phối hợp: _BieuMau.cshtml được tách commit để Hùng lấy riêng cho phần sửa sách. Không nhận phần xử lý sửa hoặc chi tiết của các thành viên khác thành sản phẩm cá nhân. Danh sách chỉ bổ sung phân trang tối thiểu và ưu tiên sách vừa lưu, không trình bày là đã làm toàn bộ bộ lọc/sắp xếp của S4-K3.</w:t>
+      </w:r>
+    </w:p>
+    <w:p>
+      <w:r>
+        <w:rPr>
+          <w:b w:val="0"/>
+        </w:rPr>
+        <w:t>CSDL: gói L2 v3 dùng NhaSachOnline_S4, còn bản master đang dùng NhaSachOnline_S3. Bản tích hợp giữ cấu hình master; đây là khác biệt cần nhóm thống nhất khi triển khai. Việc tải image SQL Server bị Forbidden nên kết quả InMemory không được coi là kiểm chứng FK/index/decimal trên SQL Server thật.</w:t>
+      </w:r>
+    </w:p>
+    <w:p>
+      <w:r>
+        <w:rPr>
+          <w:b w:val="0"/>
+        </w:rPr>
+        <w:t>GitHub: repository nhóm từ chối truy cập 403; không thực hiện push hoặc tạo PR vào đó. Theo sự đồng ý của người dùng, tệp bàn giao được đưa vào nhánh riêng trên bom-NO2/chat_gpt để tải về; nhánh main không thay đổi. Đây là bàn giao tệp, không thay cho việc tích hợp PR của nhóm.</w:t>
+      </w:r>
+    </w:p>
+    <w:p>
+      <w:pPr>
+        <w:pStyle w:val="Heading2"/>
+      </w:pPr>
+      <w:r>
+        <w:t>8.5. Sử dụng AI và rà soát kết quả</w:t>
+      </w:r>
+    </w:p>
+    <w:p>
+      <w:r>
+        <w:rPr>
+          <w:b w:val="0"/>
+        </w:rPr>
+        <w:t>Gói S4-L2 v3 kèm nhật ký của công cụ AI đã dùng khi chuẩn bị sản phẩm đó. Trong phiên hỗ trợ này, OpenAI Codex giúp đối chiếu mã, ghép S4-L4, viết kiểm thử, ghi bằng chứng và tổng hợp báo cáo; không tự nhận công việc của công cụ khác là đã được thực hiện lại trong phiên.</w:t>
+      </w:r>
+    </w:p>
+    <w:p>
+      <w:r>
+        <w:rPr>
+          <w:b w:val="0"/>
+        </w:rPr>
+        <w:t>Các phần giữ lại, điều chỉnh và lý do được ghi tại docs/prompt/lam-s4-l2.md trong gói L2, docs/prompt/lam-s4-l4.md trong gói S4-L4, và docs/prompt/lam-s4-03.md cho báo cáo. Chưa có thay đổi thủ công của Lâm được cung cấp để ghi là phần tự sửa; không gán chỉnh sửa của AI thành chỉnh sửa cá nhân.</w:t>
+      </w:r>
+    </w:p>
+    <w:p>
+      <w:r>
+        <w:rPr>
+          <w:b w:val="0"/>
+        </w:rPr>
+        <w:t>Tự rà soát báo cáo: mỗi kết quả chạy được ghi đúng phạm vi; không dùng ảnh HTML mô phỏng làm bằng chứng SQL Server; không dùng SHA cục bộ làm link commit đã push; không ghi giờ Trello hoặc trạng thái Pass khi không có hồ sơ xác nhận.</w:t>
+      </w:r>
+    </w:p>
+    <w:p>
+      <w:pPr>
+        <w:pStyle w:val="Heading2"/>
+      </w:pPr>
+      <w:r>
+        <w:t>8.6. Danh mục tài liệu và bằng chứng</w:t>
+      </w:r>
+    </w:p>
+    <w:tbl>
+      <w:tblPr>
+        <w:tblStyle w:val="TableGrid"/>
+        <w:tblW w:type="auto" w:w="0"/>
+        <w:jc w:val="center"/>
+        <w:tblLook w:firstColumn="1" w:firstRow="1" w:lastColumn="0" w:lastRow="0" w:noHBand="0" w:noVBand="1" w:val="04A0"/>
+      </w:tblPr>
+      <w:tblGrid>
+        <w:gridCol w:w="4677"/>
+        <w:gridCol w:w="4677"/>
+      </w:tblGrid>
+      <w:tr>
+        <w:trPr>
+          <w:tblHeader/>
+        </w:trPr>
         <w:tc>
           <w:tcPr>
-            <w:tcW w:type="dxa" w:w="2339"/>
+            <w:tcW w:type="dxa" w:w="4677"/>
           </w:tcPr>
           <w:p>
             <w:r>
               <w:rPr>
                 <w:sz w:val="22"/>
               </w:rPr>
-              <w:t>Bản nháp đang hoàn thiện</w:t>
+              <w:t>Nguồn</w:t>
+            </w:r>
+          </w:p>
+        </w:tc>
+        <w:tc>
+          <w:tcPr>
+            <w:tcW w:type="dxa" w:w="4677"/>
+          </w:tcPr>
+          <w:p>
+            <w:r>
+              <w:rPr>
+                <w:sz w:val="22"/>
+              </w:rPr>
+              <w:t>Nội dung sử dụng</w:t>
+            </w:r>
+          </w:p>
+        </w:tc>
+      </w:tr>
+      <w:tr>
+        <w:tc>
+          <w:tcPr>
+            <w:tcW w:type="dxa" w:w="4677"/>
+          </w:tcPr>
+          <w:p>
+            <w:r>
+              <w:rPr>
+                <w:sz w:val="22"/>
+              </w:rPr>
+              <w:t>tonkho-lam.zip/02-S4-L2-v3-deliverable</w:t>
+            </w:r>
+          </w:p>
+        </w:tc>
+        <w:tc>
+          <w:tcPr>
+            <w:tcW w:type="dxa" w:w="4677"/>
+          </w:tcPr>
+          <w:p>
+            <w:r>
+              <w:rPr>
+                <w:sz w:val="22"/>
+              </w:rPr>
+              <w:t>SQL, Model, kết nối, README, changelog và nhật ký L2</w:t>
+            </w:r>
+          </w:p>
+        </w:tc>
+      </w:tr>
+      <w:tr>
+        <w:tc>
+          <w:tcPr>
+            <w:tcW w:type="dxa" w:w="4677"/>
+          </w:tcPr>
+          <w:p>
+            <w:r>
+              <w:rPr>
+                <w:sz w:val="22"/>
+              </w:rPr>
+              <w:t>tonkho-lam.zip/06-QUY-TAC-VA-TC10-13.md</w:t>
+            </w:r>
+          </w:p>
+        </w:tc>
+        <w:tc>
+          <w:tcPr>
+            <w:tcW w:type="dxa" w:w="4677"/>
+          </w:tcPr>
+          <w:p>
+            <w:r>
+              <w:rPr>
+                <w:sz w:val="22"/>
+              </w:rPr>
+              <w:t>Quy tắc nghiệp vụ và kỳ vọng TC10–TC13</w:t>
+            </w:r>
+          </w:p>
+        </w:tc>
+      </w:tr>
+      <w:tr>
+        <w:tc>
+          <w:tcPr>
+            <w:tcW w:type="dxa" w:w="4677"/>
+          </w:tcPr>
+          <w:p>
+            <w:r>
+              <w:rPr>
+                <w:sz w:val="22"/>
+              </w:rPr>
+              <w:t>WebsiteBanSach-S4-L4.zip/NhaSachOnline</w:t>
+            </w:r>
+          </w:p>
+        </w:tc>
+        <w:tc>
+          <w:tcPr>
+            <w:tcW w:type="dxa" w:w="4677"/>
+          </w:tcPr>
+          <w:p>
+            <w:r>
+              <w:rPr>
+                <w:sz w:val="22"/>
+              </w:rPr>
+              <w:t>Mã nguồn thêm sách và điểm nối với master</w:t>
+            </w:r>
+          </w:p>
+        </w:tc>
+      </w:tr>
+      <w:tr>
+        <w:tc>
+          <w:tcPr>
+            <w:tcW w:type="dxa" w:w="4677"/>
+          </w:tcPr>
+          <w:p>
+            <w:r>
+              <w:rPr>
+                <w:sz w:val="22"/>
+              </w:rPr>
+              <w:t>WebsiteBanSach-S4-L4.zip/docs/S4-L4/evidence</w:t>
+            </w:r>
+          </w:p>
+        </w:tc>
+        <w:tc>
+          <w:tcPr>
+            <w:tcW w:type="dxa" w:w="4677"/>
+          </w:tcPr>
+          <w:p>
+            <w:r>
+              <w:rPr>
+                <w:sz w:val="22"/>
+              </w:rPr>
+              <w:t>Kết quả build Release, HTTP, Chromium, trở ngại bên ngoài</w:t>
+            </w:r>
+          </w:p>
+        </w:tc>
+      </w:tr>
+      <w:tr>
+        <w:tc>
+          <w:tcPr>
+            <w:tcW w:type="dxa" w:w="4677"/>
+          </w:tcPr>
+          <w:p>
+            <w:r>
+              <w:rPr>
+                <w:sz w:val="22"/>
+              </w:rPr>
+              <w:t>WebsiteBanSach-S4-L4.zip/docs/S4-L4/screenshots</w:t>
+            </w:r>
+          </w:p>
+        </w:tc>
+        <w:tc>
+          <w:tcPr>
+            <w:tcW w:type="dxa" w:w="4677"/>
+          </w:tcPr>
+          <w:p>
+            <w:r>
+              <w:rPr>
+                <w:sz w:val="22"/>
+              </w:rPr>
+              <w:t>Ảnh thật của test host cho TC10–TC13</w:t>
+            </w:r>
+          </w:p>
+        </w:tc>
+      </w:tr>
+      <w:tr>
+        <w:tc>
+          <w:tcPr>
+            <w:tcW w:type="dxa" w:w="4677"/>
+          </w:tcPr>
+          <w:p>
+            <w:r>
+              <w:rPr>
+                <w:sz w:val="22"/>
+              </w:rPr>
+              <w:t>WebsiteBanSach-S4-L4.zip/docs/prompt/lam-s4-l4.md</w:t>
+            </w:r>
+          </w:p>
+        </w:tc>
+        <w:tc>
+          <w:tcPr>
+            <w:tcW w:type="dxa" w:w="4677"/>
+          </w:tcPr>
+          <w:p>
+            <w:r>
+              <w:rPr>
+                <w:sz w:val="22"/>
+              </w:rPr>
+              <w:t>Nhật ký sử dụng AI và phạm vi tích hợp</w:t>
             </w:r>
           </w:p>
         </w:tc>
@@ -2552,39 +3051,7 @@
         <w:rPr>
           <w:b w:val="0"/>
         </w:rPr>
-        <w:t>Quá trình có thể kiểm chứng từ phiên hỗ trợ: nhận và phân loại gói đầu vào; dựng bản tham khảo; nhận master và các nhánh thành viên; tích hợp theo Session thực tế; sửa điểm nối nút đổi vai; chạy build, HTTP và Chromium; đóng gói và đưa ZIP lên nhánh bàn giao riêng theo sự đồng ý của người dùng. Đây là nhật ký hoạt động hỗ trợ, không phải lịch sử Trello của Lâm.</w:t>
-      </w:r>
-    </w:p>
-    <w:p>
-      <w:r>
-        <w:rPr>
-          <w:b w:val="0"/>
-        </w:rPr>
-        <w:t>Khó khăn và xử lý: mã tham khảo dùng cookie nhưng master dùng Session nên phải đổi cách ghép và test; nút đổi vai ban đầu chỉ đổi localStorage, controller không có đuôi .cs nên được sửa điểm nối; tải SQL Server bị từ chối nên giữ trạng thái chưa xác minh; repository nhóm bị 403 nên bàn giao qua nhánh riêng trên kho được kết nối, không đẩy đè master.</w:t>
-      </w:r>
-    </w:p>
-    <w:p>
-      <w:r>
-        <w:rPr>
-          <w:b w:val="0"/>
-        </w:rPr>
-        <w:t>Phân công và giới hạn: chỉ báo cáo phần S4-L1/L2/L3/L4 được giao; không nhận công việc sửa/chi tiết/danh sách của thành viên khác thành sản phẩm cá nhân. Chưa có review chính thức nên không tự ghi thẻ Pass.</w:t>
-      </w:r>
-    </w:p>
-    <w:p>
-      <w:r>
-        <w:rPr>
-          <w:b w:val="0"/>
-        </w:rPr>
-        <w:t>Sử dụng AI: OpenAI Codex hỗ trợ đối chiếu mã, tích hợp, soạn test, ghi bằng chứng và soạn bản nháp. Nội dung từ AI cần Lâm đọc lại, hiểu và đối chiếu với sản phẩm của mình. Chưa có thay đổi thủ công của Lâm được cung cấp để ghi là phần tự sửa.</w:t>
-      </w:r>
-    </w:p>
-    <w:p>
-      <w:r>
-        <w:rPr>
-          <w:b/>
-        </w:rPr>
-        <w:t>Hồ sơ cần bổ sung trước khi nộp: (1) mẫu 06 đầy đủ; (2) sản phẩm S4-L1/S4-L3; (3) link hoặc bản xuất mô tả/bình luận Trello có giờ; (4) commit/PR nhánh lam và phiếu kiểm thử; (5) thống nhất tên CSDL S3/S4 và kết quả SQL Server thật.</w:t>
+        <w:t>Báo cáo phản ánh các sản phẩm và bằng chứng có trong hai gói đầu vào. Hồ sơ hiện chưa chứng minh sản phẩm S4-L1/S4-L3, giờ Trello, phiếu kiểm thử có người xác nhận hoặc PR đã được nhóm gộp; các nội dung đó không được suy diễn từ kết quả tự động S4-L4.</w:t>
       </w:r>
     </w:p>
     <w:sectPr>
@@ -2606,7 +3073,7 @@
       <w:jc w:val="right"/>
     </w:pPr>
     <w:r>
-      <w:t xml:space="preserve">Lê Hoàng Lâm · Sprint 4 · Bản nháp | Trang </w:t>
+      <w:t xml:space="preserve">Lê Hoàng Lâm · Sprint 4 | Trang </w:t>
     </w:r>
     <w:fldSimple w:instr="PAGE"/>
   </w:p>

</xml_diff>

<commit_message>
S4-03: apply official template 06 to Lam individual report
</commit_message>
<xml_diff>
--- a/Sản phẩm yêu cầu/Lê Hoàng Lâm/Báo cáo sản phẩm cá nhân Sprint 4.docx
+++ b/Sản phẩm yêu cầu/Lê Hoàng Lâm/Báo cáo sản phẩm cá nhân Sprint 4.docx
@@ -2,23 +2,108 @@
 <file path=word/document.xml><?xml version="1.0" encoding="utf-8"?>
 <w:document xmlns:wpc="http://schemas.microsoft.com/office/word/2010/wordprocessingCanvas" xmlns:mo="http://schemas.microsoft.com/office/mac/office/2008/main" xmlns:mc="http://schemas.openxmlformats.org/markup-compatibility/2006" xmlns:mv="urn:schemas-microsoft-com:mac:vml" xmlns:o="urn:schemas-microsoft-com:office:office" xmlns:r="http://schemas.openxmlformats.org/officeDocument/2006/relationships" xmlns:m="http://schemas.openxmlformats.org/officeDocument/2006/math" xmlns:v="urn:schemas-microsoft-com:vml" xmlns:wp14="http://schemas.microsoft.com/office/word/2010/wordprocessingDrawing" xmlns:wp="http://schemas.openxmlformats.org/drawingml/2006/wordprocessingDrawing" xmlns:w10="urn:schemas-microsoft-com:office:word" xmlns:w="http://schemas.openxmlformats.org/wordprocessingml/2006/main" xmlns:w14="http://schemas.microsoft.com/office/word/2010/wordml" xmlns:wpg="http://schemas.microsoft.com/office/word/2010/wordprocessingGroup" xmlns:wpi="http://schemas.microsoft.com/office/word/2010/wordprocessingInk" xmlns:wne="http://schemas.microsoft.com/office/word/2006/wordml" xmlns:wps="http://schemas.microsoft.com/office/word/2010/wordprocessingShape" mc:Ignorable="w14 wp14">
   <w:body>
+    <w:tbl>
+      <w:tblPr>
+        <w:tblW w:type="dxa" w:w="9355"/>
+        <w:tblLayout w:type="fixed"/>
+        <w:tblLook w:firstColumn="1" w:firstRow="1" w:lastColumn="0" w:lastRow="0" w:noHBand="0" w:noVBand="1" w:val="04A0"/>
+        <w:jc w:val="center"/>
+        <w:tblBorders>
+          <w:top w:val="nil"/>
+          <w:left w:val="nil"/>
+          <w:bottom w:val="nil"/>
+          <w:right w:val="nil"/>
+          <w:insideH w:val="nil"/>
+          <w:insideV w:val="nil"/>
+        </w:tblBorders>
+        <w:tblLayout w:type="fixed"/>
+      </w:tblPr>
+      <w:tblGrid>
+        <w:gridCol w:w="3742"/>
+        <w:gridCol w:w="5613"/>
+      </w:tblGrid>
+      <w:tr>
+        <w:tc>
+          <w:tcPr>
+            <w:tcW w:type="dxa" w:w="3742"/>
+          </w:tcPr>
+          <w:p>
+            <w:pPr>
+              <w:jc w:val="center"/>
+            </w:pPr>
+            <w:r>
+              <w:rPr>
+                <w:rFonts w:ascii="Times New Roman" w:hAnsi="Times New Roman"/>
+                <w:b/>
+                <w:sz w:val="22"/>
+              </w:rPr>
+              <w:t>MÔN CÔNG NGHỆ PHẦN MỀM</w:t>
+              <w:br/>
+              <w:t>NHÓM DỰ ÁN WEBSITE BÁN SÁCH</w:t>
+              <w:br/>
+              <w:br/>
+              <w:t>Số: 05/BC-S4</w:t>
+            </w:r>
+          </w:p>
+        </w:tc>
+        <w:tc>
+          <w:tcPr>
+            <w:tcW w:type="dxa" w:w="5613"/>
+          </w:tcPr>
+          <w:p>
+            <w:pPr>
+              <w:jc w:val="center"/>
+            </w:pPr>
+            <w:r>
+              <w:rPr>
+                <w:rFonts w:ascii="Times New Roman" w:hAnsi="Times New Roman"/>
+                <w:b/>
+                <w:sz w:val="22"/>
+              </w:rPr>
+              <w:t>CỘNG HÒA XÃ HỘI CHỦ NGHĨA VIỆT NAM</w:t>
+              <w:br/>
+              <w:t>Độc lập - Tự do - Hạnh phúc</w:t>
+              <w:br/>
+              <w:br/>
+              <w:t>Ngày 19 tháng 10 năm 2026</w:t>
+            </w:r>
+          </w:p>
+        </w:tc>
+      </w:tr>
+    </w:tbl>
     <w:p>
       <w:pPr>
-        <w:pStyle w:val="Title"/>
         <w:jc w:val="center"/>
       </w:pPr>
       <w:r>
-        <w:t>BÁO CÁO SẢN PHẨM CÁ NHÂN</w:t>
-        <w:br/>
-        <w:t>SPRINT 4</w:t>
+        <w:rPr>
+          <w:b/>
+          <w:sz w:val="28"/>
+        </w:rPr>
+        <w:t>BÁO CÁO</w:t>
       </w:r>
     </w:p>
     <w:p>
+      <w:pPr>
+        <w:jc w:val="center"/>
+      </w:pPr>
+      <w:r>
+        <w:rPr>
+          <w:b/>
+          <w:sz w:val="28"/>
+        </w:rPr>
+        <w:t>Sản phẩm cá nhân Sprint 4 – Thành viên: Lê Hoàng Lâm</w:t>
+      </w:r>
+    </w:p>
+    <w:p>
+      <w:pPr>
+        <w:jc w:val="center"/>
+      </w:pPr>
       <w:r>
         <w:rPr>
           <w:b/>
         </w:rPr>
-        <w:t>Người thực hiện: Lê Hoàng Lâm</w:t>
+        <w:t>Kính gửi: Nhóm trưởng nhóm dự án Website bán sách.</w:t>
       </w:r>
     </w:p>
     <w:p>
@@ -26,7 +111,7 @@
         <w:rPr>
           <w:b w:val="0"/>
         </w:rPr>
-        <w:t>Dự án: Website bán sách trực tuyến – NhaSachOnline</w:t>
+        <w:t>Người báo cáo: Lê Hoàng Lâm    Vai trò: Thành viên    Nhánh GitHub: lam</w:t>
       </w:r>
     </w:p>
     <w:p>
@@ -34,7 +119,7 @@
         <w:rPr>
           <w:b w:val="0"/>
         </w:rPr>
-        <w:t>Sprint 4: 16/10–20/10/2026; ngày tổng hợp: 19/10/2026.</w:t>
+        <w:t>Các thẻ phụ trách: S4-L1 (CSDL 4 bước); S4-L2 (script, Model, kết nối); S4-L3 (đặc tả UC12); S4-L4 (thêm sách).</w:t>
       </w:r>
     </w:p>
     <w:p>
@@ -42,307 +127,7 @@
         <w:rPr>
           <w:b w:val="0"/>
         </w:rPr>
-        <w:t>Các thẻ cần báo cáo: S4-L1, S4-L2, S4-L3, S4-L4 và quá trình thực hiện.</w:t>
-      </w:r>
-    </w:p>
-    <w:p>
-      <w:r>
-        <w:rPr>
-          <w:b/>
-        </w:rPr>
-        <w:t>Phạm vi và nguồn báo cáo</w:t>
-      </w:r>
-    </w:p>
-    <w:p>
-      <w:r>
-        <w:rPr>
-          <w:b w:val="0"/>
-        </w:rPr>
-        <w:t>Báo cáo được tổng hợp từ hai gói tonkho-lam.zip và WebsiteBanSach-S4-L4.zip do người thực hiện cung cấp. Nội dung có bằng chứng gồm sản phẩm CSDL/Model/kết nối S4-L2 và chức năng thêm sách S4-L4; báo cáo phân biệt sản phẩm nguồn, kết quả kiểm thử tự động và những thông tin chưa có trong hồ sơ.</w:t>
-      </w:r>
-    </w:p>
-    <w:p>
-      <w:r>
-        <w:rPr>
-          <w:b w:val="0"/>
-        </w:rPr>
-        <w:t>Bố cục gồm 8 mục theo phạm vi được giao; các mục 1, 2, 3, 7 ghi Không phụ trách. Hai gói không chứa mẫu 06, nên tên các mục được đặt theo nội dung tương ứng, không coi là bản sao tên mục của mẫu chính thức.</w:t>
-      </w:r>
-    </w:p>
-    <w:p>
-      <w:r>
-        <w:rPr>
-          <w:b w:val="0"/>
-        </w:rPr>
-        <w:t>Mỗi hình được giải thích theo 5 ý: tên và thẻ; mục đích; nội dung; cách thực hiện; kết quả và bằng chứng.</w:t>
-      </w:r>
-    </w:p>
-    <w:tbl>
-      <w:tblPr>
-        <w:tblStyle w:val="TableGrid"/>
-        <w:tblW w:type="auto" w:w="0"/>
-        <w:jc w:val="center"/>
-        <w:tblLook w:firstColumn="1" w:firstRow="1" w:lastColumn="0" w:lastRow="0" w:noHBand="0" w:noVBand="1" w:val="04A0"/>
-      </w:tblPr>
-      <w:tblGrid>
-        <w:gridCol w:w="3118"/>
-        <w:gridCol w:w="3118"/>
-        <w:gridCol w:w="3118"/>
-      </w:tblGrid>
-      <w:tr>
-        <w:trPr>
-          <w:tblHeader/>
-        </w:trPr>
-        <w:tc>
-          <w:tcPr>
-            <w:tcW w:type="dxa" w:w="3118"/>
-          </w:tcPr>
-          <w:p>
-            <w:r>
-              <w:rPr>
-                <w:sz w:val="22"/>
-              </w:rPr>
-              <w:t>Mục</w:t>
-            </w:r>
-          </w:p>
-        </w:tc>
-        <w:tc>
-          <w:tcPr>
-            <w:tcW w:type="dxa" w:w="3118"/>
-          </w:tcPr>
-          <w:p>
-            <w:r>
-              <w:rPr>
-                <w:sz w:val="22"/>
-              </w:rPr>
-              <w:t>Phạm vi</w:t>
-            </w:r>
-          </w:p>
-        </w:tc>
-        <w:tc>
-          <w:tcPr>
-            <w:tcW w:type="dxa" w:w="3118"/>
-          </w:tcPr>
-          <w:p>
-            <w:r>
-              <w:rPr>
-                <w:sz w:val="22"/>
-              </w:rPr>
-              <w:t>Sản phẩm trình bày</w:t>
-            </w:r>
-          </w:p>
-        </w:tc>
-      </w:tr>
-      <w:tr>
-        <w:tc>
-          <w:tcPr>
-            <w:tcW w:type="dxa" w:w="3118"/>
-          </w:tcPr>
-          <w:p>
-            <w:r>
-              <w:rPr>
-                <w:sz w:val="22"/>
-              </w:rPr>
-              <w:t>1, 2, 3, 7</w:t>
-            </w:r>
-          </w:p>
-        </w:tc>
-        <w:tc>
-          <w:tcPr>
-            <w:tcW w:type="dxa" w:w="3118"/>
-          </w:tcPr>
-          <w:p>
-            <w:r>
-              <w:rPr>
-                <w:sz w:val="22"/>
-              </w:rPr>
-              <w:t>Không phụ trách</w:t>
-            </w:r>
-          </w:p>
-        </w:tc>
-        <w:tc>
-          <w:tcPr>
-            <w:tcW w:type="dxa" w:w="3118"/>
-          </w:tcPr>
-          <w:p>
-            <w:r>
-              <w:rPr>
-                <w:sz w:val="22"/>
-              </w:rPr>
-              <w:t>Không trình bày sản phẩm của thành viên khác</w:t>
-            </w:r>
-          </w:p>
-        </w:tc>
-      </w:tr>
-      <w:tr>
-        <w:tc>
-          <w:tcPr>
-            <w:tcW w:type="dxa" w:w="3118"/>
-          </w:tcPr>
-          <w:p>
-            <w:r>
-              <w:rPr>
-                <w:sz w:val="22"/>
-              </w:rPr>
-              <w:t>4</w:t>
-            </w:r>
-          </w:p>
-        </w:tc>
-        <w:tc>
-          <w:tcPr>
-            <w:tcW w:type="dxa" w:w="3118"/>
-          </w:tcPr>
-          <w:p>
-            <w:r>
-              <w:rPr>
-                <w:sz w:val="22"/>
-              </w:rPr>
-              <w:t>S4-L1</w:t>
-            </w:r>
-          </w:p>
-        </w:tc>
-        <w:tc>
-          <w:tcPr>
-            <w:tcW w:type="dxa" w:w="3118"/>
-          </w:tcPr>
-          <w:p>
-            <w:r>
-              <w:rPr>
-                <w:sz w:val="22"/>
-              </w:rPr>
-              <w:t>Ghi rõ phạm vi hồ sơ được cung cấp</w:t>
-            </w:r>
-          </w:p>
-        </w:tc>
-      </w:tr>
-      <w:tr>
-        <w:tc>
-          <w:tcPr>
-            <w:tcW w:type="dxa" w:w="3118"/>
-          </w:tcPr>
-          <w:p>
-            <w:r>
-              <w:rPr>
-                <w:sz w:val="22"/>
-              </w:rPr>
-              <w:t>5</w:t>
-            </w:r>
-          </w:p>
-        </w:tc>
-        <w:tc>
-          <w:tcPr>
-            <w:tcW w:type="dxa" w:w="3118"/>
-          </w:tcPr>
-          <w:p>
-            <w:r>
-              <w:rPr>
-                <w:sz w:val="22"/>
-              </w:rPr>
-              <w:t>S4-L3</w:t>
-            </w:r>
-          </w:p>
-        </w:tc>
-        <w:tc>
-          <w:tcPr>
-            <w:tcW w:type="dxa" w:w="3118"/>
-          </w:tcPr>
-          <w:p>
-            <w:r>
-              <w:rPr>
-                <w:sz w:val="22"/>
-              </w:rPr>
-              <w:t>Ghi rõ phạm vi hồ sơ được cung cấp</w:t>
-            </w:r>
-          </w:p>
-        </w:tc>
-      </w:tr>
-      <w:tr>
-        <w:tc>
-          <w:tcPr>
-            <w:tcW w:type="dxa" w:w="3118"/>
-          </w:tcPr>
-          <w:p>
-            <w:r>
-              <w:rPr>
-                <w:sz w:val="22"/>
-              </w:rPr>
-              <w:t>6</w:t>
-            </w:r>
-          </w:p>
-        </w:tc>
-        <w:tc>
-          <w:tcPr>
-            <w:tcW w:type="dxa" w:w="3118"/>
-          </w:tcPr>
-          <w:p>
-            <w:r>
-              <w:rPr>
-                <w:sz w:val="22"/>
-              </w:rPr>
-              <w:t>S4-L2, S4-L4</w:t>
-            </w:r>
-          </w:p>
-        </w:tc>
-        <w:tc>
-          <w:tcPr>
-            <w:tcW w:type="dxa" w:w="3118"/>
-          </w:tcPr>
-          <w:p>
-            <w:r>
-              <w:rPr>
-                <w:sz w:val="22"/>
-              </w:rPr>
-              <w:t>CSDL, Model, kết nối, code thêm sách và bằng chứng kiểm thử</w:t>
-            </w:r>
-          </w:p>
-        </w:tc>
-      </w:tr>
-      <w:tr>
-        <w:tc>
-          <w:tcPr>
-            <w:tcW w:type="dxa" w:w="3118"/>
-          </w:tcPr>
-          <w:p>
-            <w:r>
-              <w:rPr>
-                <w:sz w:val="22"/>
-              </w:rPr>
-              <w:t>8</w:t>
-            </w:r>
-          </w:p>
-        </w:tc>
-        <w:tc>
-          <w:tcPr>
-            <w:tcW w:type="dxa" w:w="3118"/>
-          </w:tcPr>
-          <w:p>
-            <w:r>
-              <w:rPr>
-                <w:sz w:val="22"/>
-              </w:rPr>
-              <w:t>Quá trình</w:t>
-            </w:r>
-          </w:p>
-        </w:tc>
-        <w:tc>
-          <w:tcPr>
-            <w:tcW w:type="dxa" w:w="3118"/>
-          </w:tcPr>
-          <w:p>
-            <w:r>
-              <w:rPr>
-                <w:sz w:val="22"/>
-              </w:rPr>
-              <w:t>Trình tự thực hiện, phối hợp, khó khăn và sử dụng AI</w:t>
-            </w:r>
-          </w:p>
-        </w:tc>
-      </w:tr>
-    </w:tbl>
-    <w:p/>
-    <w:p>
-      <w:r>
-        <w:br w:type="page"/>
+        <w:t>Báo cáo được điền theo mẫu 06, dựa trên tonkho-lam.zip, WebsiteBanSach-S4-L4.zip và bản báo cáo chung đã cung cấp. Kết quả được ghi theo bằng chứng hiện có; các số liệu minh họa và trạng thái Pass trong phần ví dụ của mẫu không được dùng làm kết quả cá nhân.</w:t>
       </w:r>
     </w:p>
     <w:p>
@@ -350,7 +135,7 @@
         <w:pStyle w:val="Heading1"/>
       </w:pPr>
       <w:r>
-        <w:t>1. Mục 1</w:t>
+        <w:t>1. Phát biểu bài toán</w:t>
       </w:r>
     </w:p>
     <w:p>
@@ -366,7 +151,7 @@
         <w:pStyle w:val="Heading1"/>
       </w:pPr>
       <w:r>
-        <w:t>2. Mục 2</w:t>
+        <w:t>2. Khảo sát</w:t>
       </w:r>
     </w:p>
     <w:p>
@@ -382,7 +167,7 @@
         <w:pStyle w:val="Heading1"/>
       </w:pPr>
       <w:r>
-        <w:t>3. Mục 3</w:t>
+        <w:t>3. Thiết kế giao diện</w:t>
       </w:r>
     </w:p>
     <w:p>
@@ -398,7 +183,15 @@
         <w:pStyle w:val="Heading1"/>
       </w:pPr>
       <w:r>
-        <w:t>4. Sản phẩm thẻ S4-L1</w:t>
+        <w:t>4. Thiết kế cơ sở dữ liệu</w:t>
+      </w:r>
+    </w:p>
+    <w:p>
+      <w:pPr>
+        <w:pStyle w:val="Heading2"/>
+      </w:pPr>
+      <w:r>
+        <w:t>S4-L1. Thiết kế CSDL theo 4 bước</w:t>
       </w:r>
     </w:p>
     <w:p>
@@ -406,7 +199,550 @@
         <w:rPr>
           <w:b w:val="0"/>
         </w:rPr>
-        <w:t>Theo phân công, S4-L1 thuộc phần việc của Lê Hoàng Lâm. Tuy nhiên, hai gói đầu vào không có mô tả thẻ hoặc sản phẩm sơ đồ mang mã S4-L1. Vì vậy, báo cáo không chèn sơ đồ tự suy đoán và không sử dụng sản phẩm của thành viên khác để thay thế phần việc này.</w:t>
+        <w:t>Phần dưới tổng hợp thiết kế từ script SQL trong hồ sơ để trình bày đúng cấu trúc mẫu 06. Sơ đồ nhóm sách được tái dựng khi soạn báo cáo, không ghi là bản S4-L1 đã được người kiểm tra chấm Pass. Bản chung ngày 15/10 có 27 bảng của một phiên bản mở rộng; script master đi kèm bản S4-L4 hiện có 23 bảng. Báo cáo không gộp hai số liệu thành cùng một phiên bản.</w:t>
+      </w:r>
+    </w:p>
+    <w:tbl>
+      <w:tblPr>
+        <w:tblStyle w:val="TableGrid"/>
+        <w:tblW w:type="auto" w:w="0"/>
+        <w:jc w:val="center"/>
+        <w:tblLook w:firstColumn="1" w:firstRow="1" w:lastColumn="0" w:lastRow="0" w:noHBand="0" w:noVBand="1" w:val="04A0"/>
+      </w:tblPr>
+      <w:tblGrid>
+        <w:gridCol w:w="4677"/>
+        <w:gridCol w:w="4677"/>
+      </w:tblGrid>
+      <w:tr>
+        <w:trPr>
+          <w:tblHeader/>
+        </w:trPr>
+        <w:tc>
+          <w:tcPr>
+            <w:tcW w:type="dxa" w:w="4677"/>
+          </w:tcPr>
+          <w:p>
+            <w:r>
+              <w:rPr>
+                <w:sz w:val="22"/>
+              </w:rPr>
+              <w:t>Bước</w:t>
+            </w:r>
+          </w:p>
+        </w:tc>
+        <w:tc>
+          <w:tcPr>
+            <w:tcW w:type="dxa" w:w="4677"/>
+          </w:tcPr>
+          <w:p>
+            <w:r>
+              <w:rPr>
+                <w:sz w:val="22"/>
+              </w:rPr>
+              <w:t>Sản phẩm và giải thích</w:t>
+            </w:r>
+          </w:p>
+        </w:tc>
+      </w:tr>
+      <w:tr>
+        <w:tc>
+          <w:tcPr>
+            <w:tcW w:type="dxa" w:w="4677"/>
+          </w:tcPr>
+          <w:p>
+            <w:r>
+              <w:rPr>
+                <w:sz w:val="22"/>
+              </w:rPr>
+              <w:t>1. Thực thể, khóa chính, thuộc tính</w:t>
+            </w:r>
+          </w:p>
+        </w:tc>
+        <w:tc>
+          <w:tcPr>
+            <w:tcW w:type="dxa" w:w="4677"/>
+          </w:tcPr>
+          <w:p>
+            <w:r>
+              <w:rPr>
+                <w:sz w:val="22"/>
+              </w:rPr>
+              <w:t>Nhóm trực tiếp phục vụ quản lý sách: Sach, TacGia, TheLoai, NhaXuatBan, NhanVien, DeXuatGia. MaSach/MaTacGia/MaTheLoai/MaNXB/MaNhanVien/MaDeXuat là khóa chính. Địa chỉ khách và tác giả không ghép thành cột danh sách trong Sach.</w:t>
+            </w:r>
+          </w:p>
+        </w:tc>
+      </w:tr>
+      <w:tr>
+        <w:tc>
+          <w:tcPr>
+            <w:tcW w:type="dxa" w:w="4677"/>
+          </w:tcPr>
+          <w:p>
+            <w:r>
+              <w:rPr>
+                <w:sz w:val="22"/>
+              </w:rPr>
+              <w:t>2. Quan hệ</w:t>
+            </w:r>
+          </w:p>
+        </w:tc>
+        <w:tc>
+          <w:tcPr>
+            <w:tcW w:type="dxa" w:w="4677"/>
+          </w:tcPr>
+          <w:p>
+            <w:r>
+              <w:rPr>
+                <w:sz w:val="22"/>
+              </w:rPr>
+              <w:t>TheLoai–Sach và NhaXuatBan–Sach: 1–n. Sach–TacGia: n–m qua SachTacGia. Sach–DeXuatGia: 1–n. NhanVien được tham chiếu ở người tạo, cập nhật, đề xuất và duyệt. Khóa ghép (MaSach, MaTacGia) tránh lặp cùng một liên kết.</w:t>
+            </w:r>
+          </w:p>
+        </w:tc>
+      </w:tr>
+      <w:tr>
+        <w:tc>
+          <w:tcPr>
+            <w:tcW w:type="dxa" w:w="4677"/>
+          </w:tcPr>
+          <w:p>
+            <w:r>
+              <w:rPr>
+                <w:sz w:val="22"/>
+              </w:rPr>
+              <w:t>3. Chuẩn hóa</w:t>
+            </w:r>
+          </w:p>
+        </w:tc>
+        <w:tc>
+          <w:tcPr>
+            <w:tcW w:type="dxa" w:w="4677"/>
+          </w:tcPr>
+          <w:p>
+            <w:r>
+              <w:rPr>
+                <w:sz w:val="22"/>
+              </w:rPr>
+              <w:t>1NF: mỗi ô lưu giá trị đơn; mỗi tác giả là một dòng của TacGia. 2NF: các thuộc tính của bảng liên kết có khóa ghép phải phụ thuộc toàn bộ khóa. 3NF: tên thể loại/NXB/tác giả nằm ở bảng riêng, Sach giữ mã tham chiếu; không sao chép các tên này vào mỗi dòng sách. Giá cũ/mới của đề xuất là dữ liệu lịch sử, không thay giá bán trước khi duyệt.</w:t>
+            </w:r>
+          </w:p>
+        </w:tc>
+      </w:tr>
+      <w:tr>
+        <w:tc>
+          <w:tcPr>
+            <w:tcW w:type="dxa" w:w="4677"/>
+          </w:tcPr>
+          <w:p>
+            <w:r>
+              <w:rPr>
+                <w:sz w:val="22"/>
+              </w:rPr>
+              <w:t>4. ERD và thiết kế bảng</w:t>
+            </w:r>
+          </w:p>
+        </w:tc>
+        <w:tc>
+          <w:tcPr>
+            <w:tcW w:type="dxa" w:w="4677"/>
+          </w:tcPr>
+          <w:p>
+            <w:r>
+              <w:rPr>
+                <w:sz w:val="22"/>
+              </w:rPr>
+              <w:t>Sơ đồ dưới thể hiện các khóa và quan hệ trực tiếp phục vụ thêm sách. Thiết kế vật lý dùng INT IDENTITY cho mã, NVARCHAR cho tiếng Việt, DECIMAL(12,0) cho giá, DATETIME2 cho thời gian, FK và CHECK theo từng cột. Script đầy đủ: database/01_tao_bang.sql.</w:t>
+            </w:r>
+          </w:p>
+        </w:tc>
+      </w:tr>
+    </w:tbl>
+    <w:p/>
+    <w:p>
+      <w:pPr>
+        <w:keepNext/>
+      </w:pPr>
+      <w:r>
+        <w:drawing>
+          <wp:inline xmlns:a="http://schemas.openxmlformats.org/drawingml/2006/main" xmlns:pic="http://schemas.openxmlformats.org/drawingml/2006/picture">
+            <wp:extent cx="5760000" cy="1483872"/>
+            <wp:docPr id="1" name="Picture 1"/>
+            <wp:cNvGraphicFramePr>
+              <a:graphicFrameLocks noChangeAspect="1"/>
+            </wp:cNvGraphicFramePr>
+            <a:graphic>
+              <a:graphicData uri="http://schemas.openxmlformats.org/drawingml/2006/picture">
+                <pic:pic>
+                  <pic:nvPicPr>
+                    <pic:cNvPr id="0" name="erd-sach.png"/>
+                    <pic:cNvPicPr/>
+                  </pic:nvPicPr>
+                  <pic:blipFill>
+                    <a:blip r:embed="rId10"/>
+                    <a:stretch>
+                      <a:fillRect/>
+                    </a:stretch>
+                  </pic:blipFill>
+                  <pic:spPr>
+                    <a:xfrm>
+                      <a:off x="0" y="0"/>
+                      <a:ext cx="5760000" cy="1483872"/>
+                    </a:xfrm>
+                    <a:prstGeom prst="rect"/>
+                  </pic:spPr>
+                </pic:pic>
+              </a:graphicData>
+            </a:graphic>
+          </wp:inline>
+        </w:drawing>
+      </w:r>
+    </w:p>
+    <w:p>
+      <w:pPr>
+        <w:pStyle w:val="Caption"/>
+        <w:keepNext/>
+      </w:pPr>
+      <w:r>
+        <w:t>Hình 1: ERD nhóm quản lý sách tái dựng từ script SQL trong hồ sơ</w:t>
+      </w:r>
+    </w:p>
+    <w:p>
+      <w:r>
+        <w:rPr>
+          <w:b/>
+        </w:rPr>
+        <w:t xml:space="preserve">Mục đích: </w:t>
+      </w:r>
+      <w:r>
+        <w:t>Làm rõ quan hệ và khóa của các bảng được chức năng thêm sách sử dụng.</w:t>
+      </w:r>
+    </w:p>
+    <w:p>
+      <w:r>
+        <w:rPr>
+          <w:b/>
+        </w:rPr>
+        <w:t xml:space="preserve">Trạng thái ban đầu: </w:t>
+      </w:r>
+      <w:r>
+        <w:t>Có script tạo bảng và model của bản master trong gói S4-L4; chưa thực thi script trên SQL Server ở phiên này.</w:t>
+      </w:r>
+    </w:p>
+    <w:p>
+      <w:r>
+        <w:rPr>
+          <w:b/>
+        </w:rPr>
+        <w:t xml:space="preserve">Thao tác và dữ liệu nhập: </w:t>
+      </w:r>
+      <w:r>
+        <w:t>Đọc định nghĩa bảng/FK trong 01_tao_bang.sql, đối chiếu NhaSachContext, dựng lại nhóm sách bằng Graphviz. Sơ đồ lược bớt các thuộc tính không cần cho quan hệ.</w:t>
+      </w:r>
+    </w:p>
+    <w:p>
+      <w:r>
+        <w:rPr>
+          <w:b/>
+        </w:rPr>
+        <w:t xml:space="preserve">Kết quả nhìn thấy: </w:t>
+      </w:r>
+      <w:r>
+        <w:t>Thể loại, NXB và nhân viên tạo/cập nhật có quan hệ 1–n với sách; tác giả được gắn qua SachTacGia; DeXuatGia tách khỏi giá bán hiện hành.</w:t>
+      </w:r>
+    </w:p>
+    <w:p>
+      <w:r>
+        <w:rPr>
+          <w:b/>
+        </w:rPr>
+        <w:t xml:space="preserve">Nhận xét: </w:t>
+      </w:r>
+      <w:r>
+        <w:t>Đây là sơ đồ tài liệu hóa mới từ mã nguồn, không phải ảnh CSDL đang chạy hoặc bản ERD 27 bảng cũ. Cần đối chiếu bản thiết kế S4-L1 đã review khi nhóm xác nhận phiên bản cuối.</w:t>
+      </w:r>
+    </w:p>
+    <w:tbl>
+      <w:tblPr>
+        <w:tblStyle w:val="TableGrid"/>
+        <w:tblW w:type="auto" w:w="0"/>
+        <w:jc w:val="center"/>
+        <w:tblLook w:firstColumn="1" w:firstRow="1" w:lastColumn="0" w:lastRow="0" w:noHBand="0" w:noVBand="1" w:val="04A0"/>
+      </w:tblPr>
+      <w:tblGrid>
+        <w:gridCol w:w="4677"/>
+        <w:gridCol w:w="4677"/>
+      </w:tblGrid>
+      <w:tr>
+        <w:trPr>
+          <w:tblHeader/>
+        </w:trPr>
+        <w:tc>
+          <w:tcPr>
+            <w:tcW w:type="dxa" w:w="4677"/>
+          </w:tcPr>
+          <w:p>
+            <w:r>
+              <w:rPr>
+                <w:sz w:val="22"/>
+              </w:rPr>
+              <w:t>Bảng/cột chính</w:t>
+            </w:r>
+          </w:p>
+        </w:tc>
+        <w:tc>
+          <w:tcPr>
+            <w:tcW w:type="dxa" w:w="4677"/>
+          </w:tcPr>
+          <w:p>
+            <w:r>
+              <w:rPr>
+                <w:sz w:val="22"/>
+              </w:rPr>
+              <w:t>Kiểu, khóa và ràng buộc</w:t>
+            </w:r>
+          </w:p>
+        </w:tc>
+      </w:tr>
+      <w:tr>
+        <w:tc>
+          <w:tcPr>
+            <w:tcW w:type="dxa" w:w="4677"/>
+          </w:tcPr>
+          <w:p>
+            <w:r>
+              <w:rPr>
+                <w:sz w:val="22"/>
+              </w:rPr>
+              <w:t>Sach.MaSach, TenSach, ISBN</w:t>
+            </w:r>
+          </w:p>
+        </w:tc>
+        <w:tc>
+          <w:tcPr>
+            <w:tcW w:type="dxa" w:w="4677"/>
+          </w:tcPr>
+          <w:p>
+            <w:r>
+              <w:rPr>
+                <w:sz w:val="22"/>
+              </w:rPr>
+              <w:t>INT IDENTITY PK; TenSach NVARCHAR(200) NOT NULL; ISBN VARCHAR(13) NULL, unique index khi không NULL.</w:t>
+            </w:r>
+          </w:p>
+        </w:tc>
+      </w:tr>
+      <w:tr>
+        <w:tc>
+          <w:tcPr>
+            <w:tcW w:type="dxa" w:w="4677"/>
+          </w:tcPr>
+          <w:p>
+            <w:r>
+              <w:rPr>
+                <w:sz w:val="22"/>
+              </w:rPr>
+              <w:t>Sach.MaTheLoai, MaNXB</w:t>
+            </w:r>
+          </w:p>
+        </w:tc>
+        <w:tc>
+          <w:tcPr>
+            <w:tcW w:type="dxa" w:w="4677"/>
+          </w:tcPr>
+          <w:p>
+            <w:r>
+              <w:rPr>
+                <w:sz w:val="22"/>
+              </w:rPr>
+              <w:t>INT NOT NULL; FK tới TheLoai, NhaXuatBan. Biểu mẫu chỉ nhận thể loại đang hoạt động và NXB tồn tại.</w:t>
+            </w:r>
+          </w:p>
+        </w:tc>
+      </w:tr>
+      <w:tr>
+        <w:tc>
+          <w:tcPr>
+            <w:tcW w:type="dxa" w:w="4677"/>
+          </w:tcPr>
+          <w:p>
+            <w:r>
+              <w:rPr>
+                <w:sz w:val="22"/>
+              </w:rPr>
+              <w:t>Sach.NamXuatBan, HinhThuc</w:t>
+            </w:r>
+          </w:p>
+        </w:tc>
+        <w:tc>
+          <w:tcPr>
+            <w:tcW w:type="dxa" w:w="4677"/>
+          </w:tcPr>
+          <w:p>
+            <w:r>
+              <w:rPr>
+                <w:sz w:val="22"/>
+              </w:rPr>
+              <w:t>SMALLINT CHECK 1900–2100; TINYINT CHECK 1/2 (bìa mềm/bìa cứng).</w:t>
+            </w:r>
+          </w:p>
+        </w:tc>
+      </w:tr>
+      <w:tr>
+        <w:tc>
+          <w:tcPr>
+            <w:tcW w:type="dxa" w:w="4677"/>
+          </w:tcPr>
+          <w:p>
+            <w:r>
+              <w:rPr>
+                <w:sz w:val="22"/>
+              </w:rPr>
+              <w:t>Sach.GiaBan, SoLuongCoTheBan, TrangThai</w:t>
+            </w:r>
+          </w:p>
+        </w:tc>
+        <w:tc>
+          <w:tcPr>
+            <w:tcW w:type="dxa" w:w="4677"/>
+          </w:tcPr>
+          <w:p>
+            <w:r>
+              <w:rPr>
+                <w:sz w:val="22"/>
+              </w:rPr>
+              <w:t>DECIMAL(12,0) &gt;0; INT &gt;=0; TINYINT 0–3, DEFAULT 2 (chờ duyệt). Biểu mẫu áp dụng thêm giới hạn nghiệp vụ.</w:t>
+            </w:r>
+          </w:p>
+        </w:tc>
+      </w:tr>
+      <w:tr>
+        <w:tc>
+          <w:tcPr>
+            <w:tcW w:type="dxa" w:w="4677"/>
+          </w:tcPr>
+          <w:p>
+            <w:r>
+              <w:rPr>
+                <w:sz w:val="22"/>
+              </w:rPr>
+              <w:t>Sach.NgayTao, NgayCapNhat, NguoiTao, NguoiCapNhat</w:t>
+            </w:r>
+          </w:p>
+        </w:tc>
+        <w:tc>
+          <w:tcPr>
+            <w:tcW w:type="dxa" w:w="4677"/>
+          </w:tcPr>
+          <w:p>
+            <w:r>
+              <w:rPr>
+                <w:sz w:val="22"/>
+              </w:rPr>
+              <w:t>DATETIME2 với mặc định thời gian hệ thống; mã người tạo/cập nhật là FK tới NhanVien.</w:t>
+            </w:r>
+          </w:p>
+        </w:tc>
+      </w:tr>
+      <w:tr>
+        <w:tc>
+          <w:tcPr>
+            <w:tcW w:type="dxa" w:w="4677"/>
+          </w:tcPr>
+          <w:p>
+            <w:r>
+              <w:rPr>
+                <w:sz w:val="22"/>
+              </w:rPr>
+              <w:t>TacGia và SachTacGia</w:t>
+            </w:r>
+          </w:p>
+        </w:tc>
+        <w:tc>
+          <w:tcPr>
+            <w:tcW w:type="dxa" w:w="4677"/>
+          </w:tcPr>
+          <w:p>
+            <w:r>
+              <w:rPr>
+                <w:sz w:val="22"/>
+              </w:rPr>
+              <w:t>TacGia có PK MaTacGia và TenTacGia NVARCHAR(150). SachTacGia có hai FK và PK ghép (MaSach, MaTacGia).</w:t>
+            </w:r>
+          </w:p>
+        </w:tc>
+      </w:tr>
+      <w:tr>
+        <w:tc>
+          <w:tcPr>
+            <w:tcW w:type="dxa" w:w="4677"/>
+          </w:tcPr>
+          <w:p>
+            <w:r>
+              <w:rPr>
+                <w:sz w:val="22"/>
+              </w:rPr>
+              <w:t>TheLoai và NhaXuatBan</w:t>
+            </w:r>
+          </w:p>
+        </w:tc>
+        <w:tc>
+          <w:tcPr>
+            <w:tcW w:type="dxa" w:w="4677"/>
+          </w:tcPr>
+          <w:p>
+            <w:r>
+              <w:rPr>
+                <w:sz w:val="22"/>
+              </w:rPr>
+              <w:t>PK kiểu INT; tên NOT NULL và UNIQUE; TheLoai có TrangThai 0/1.</w:t>
+            </w:r>
+          </w:p>
+        </w:tc>
+      </w:tr>
+      <w:tr>
+        <w:tc>
+          <w:tcPr>
+            <w:tcW w:type="dxa" w:w="4677"/>
+          </w:tcPr>
+          <w:p>
+            <w:r>
+              <w:rPr>
+                <w:sz w:val="22"/>
+              </w:rPr>
+              <w:t>DeXuatGia</w:t>
+            </w:r>
+          </w:p>
+        </w:tc>
+        <w:tc>
+          <w:tcPr>
+            <w:tcW w:type="dxa" w:w="4677"/>
+          </w:tcPr>
+          <w:p>
+            <w:r>
+              <w:rPr>
+                <w:sz w:val="22"/>
+              </w:rPr>
+              <w:t>MaDeXuat PK; MaSach FK; GiaCu/GiaMoi DECIMAL(12,0); trạng thái 0/1/2; người đề xuất/duyệt và thời gian.</w:t>
+            </w:r>
+          </w:p>
+        </w:tc>
+      </w:tr>
+    </w:tbl>
+    <w:p/>
+    <w:p>
+      <w:pPr>
+        <w:pStyle w:val="Heading1"/>
+      </w:pPr>
+      <w:r>
+        <w:t>5. Thiết kế hệ thống – Use Case, Activity, biểu đồ lớp</w:t>
+      </w:r>
+    </w:p>
+    <w:p>
+      <w:pPr>
+        <w:pStyle w:val="Heading2"/>
+      </w:pPr>
+      <w:r>
+        <w:t>S4-L3. Bảng đối chiếu đặc tả UC12 – Quản lý sách</w:t>
       </w:r>
     </w:p>
     <w:p>
@@ -414,39 +750,311 @@
         <w:rPr>
           <w:b w:val="0"/>
         </w:rPr>
-        <w:t>Trạng thái hồ sơ: chưa có sản phẩm S4-L1 để trích dẫn trong phạm vi hai gói được cung cấp. Đây là thẻ được phân công, không phải mục Không phụ trách.</w:t>
+        <w:t>Mẫu 06 xác định S4-L3 là bảng đặc tả UC12. Chưa có tệp đặc tả S4-L3 đã review trong hai ZIP; bảng dưới được tổng hợp từ mã nguồn và quy tắc hiện có để trình bày sản phẩm trong báo cáo, không dùng phần ví dụ giả định của mẫu làm bằng chứng. Các sơ đồ Use Case/Activity/lớp của thành viên khác không được nhận là sản phẩm cá nhân của Lâm.</w:t>
       </w:r>
     </w:p>
+    <w:tbl>
+      <w:tblPr>
+        <w:tblStyle w:val="TableGrid"/>
+        <w:tblW w:type="auto" w:w="0"/>
+        <w:jc w:val="center"/>
+        <w:tblLook w:firstColumn="1" w:firstRow="1" w:lastColumn="0" w:lastRow="0" w:noHBand="0" w:noVBand="1" w:val="04A0"/>
+      </w:tblPr>
+      <w:tblGrid>
+        <w:gridCol w:w="4677"/>
+        <w:gridCol w:w="4677"/>
+      </w:tblGrid>
+      <w:tr>
+        <w:trPr>
+          <w:tblHeader/>
+        </w:trPr>
+        <w:tc>
+          <w:tcPr>
+            <w:tcW w:type="dxa" w:w="4677"/>
+          </w:tcPr>
+          <w:p>
+            <w:r>
+              <w:rPr>
+                <w:sz w:val="22"/>
+              </w:rPr>
+              <w:t>Thành phần</w:t>
+            </w:r>
+          </w:p>
+        </w:tc>
+        <w:tc>
+          <w:tcPr>
+            <w:tcW w:type="dxa" w:w="4677"/>
+          </w:tcPr>
+          <w:p>
+            <w:r>
+              <w:rPr>
+                <w:sz w:val="22"/>
+              </w:rPr>
+              <w:t>Đặc tả đối chiếu từ mã hiện có</w:t>
+            </w:r>
+          </w:p>
+        </w:tc>
+      </w:tr>
+      <w:tr>
+        <w:tc>
+          <w:tcPr>
+            <w:tcW w:type="dxa" w:w="4677"/>
+          </w:tcPr>
+          <w:p>
+            <w:r>
+              <w:rPr>
+                <w:sz w:val="22"/>
+              </w:rPr>
+              <w:t>Mã và tên</w:t>
+            </w:r>
+          </w:p>
+        </w:tc>
+        <w:tc>
+          <w:tcPr>
+            <w:tcW w:type="dxa" w:w="4677"/>
+          </w:tcPr>
+          <w:p>
+            <w:r>
+              <w:rPr>
+                <w:sz w:val="22"/>
+              </w:rPr>
+              <w:t>UC12 – Quản lý sách; phần triển khai cá nhân tập trung thao tác thêm sách.</w:t>
+            </w:r>
+          </w:p>
+        </w:tc>
+      </w:tr>
+      <w:tr>
+        <w:tc>
+          <w:tcPr>
+            <w:tcW w:type="dxa" w:w="4677"/>
+          </w:tcPr>
+          <w:p>
+            <w:r>
+              <w:rPr>
+                <w:sz w:val="22"/>
+              </w:rPr>
+              <w:t>Tác nhân</w:t>
+            </w:r>
+          </w:p>
+        </w:tc>
+        <w:tc>
+          <w:tcPr>
+            <w:tcW w:type="dxa" w:w="4677"/>
+          </w:tcPr>
+          <w:p>
+            <w:r>
+              <w:rPr>
+                <w:sz w:val="22"/>
+              </w:rPr>
+              <w:t>Nhân viên, Quản lý; khách chỉ xem sách đang bán và không được thực hiện thao tác nội bộ.</w:t>
+            </w:r>
+          </w:p>
+        </w:tc>
+      </w:tr>
+      <w:tr>
+        <w:tc>
+          <w:tcPr>
+            <w:tcW w:type="dxa" w:w="4677"/>
+          </w:tcPr>
+          <w:p>
+            <w:r>
+              <w:rPr>
+                <w:sz w:val="22"/>
+              </w:rPr>
+              <w:t>Tiền điều kiện</w:t>
+            </w:r>
+          </w:p>
+        </w:tc>
+        <w:tc>
+          <w:tcPr>
+            <w:tcW w:type="dxa" w:w="4677"/>
+          </w:tcPr>
+          <w:p>
+            <w:r>
+              <w:rPr>
+                <w:sz w:val="22"/>
+              </w:rPr>
+              <w:t>Session mang vai hợp lệ; danh mục/NXB tồn tại; kết nối CSDL được cấu hình. Cơ chế Session hiện tại phục vụ thử vai, chưa phải hệ thống đăng nhập thật.</w:t>
+            </w:r>
+          </w:p>
+        </w:tc>
+      </w:tr>
+      <w:tr>
+        <w:tc>
+          <w:tcPr>
+            <w:tcW w:type="dxa" w:w="4677"/>
+          </w:tcPr>
+          <w:p>
+            <w:r>
+              <w:rPr>
+                <w:sz w:val="22"/>
+              </w:rPr>
+              <w:t>Luồng chính thêm sách</w:t>
+            </w:r>
+          </w:p>
+        </w:tc>
+        <w:tc>
+          <w:tcPr>
+            <w:tcW w:type="dxa" w:w="4677"/>
+          </w:tcPr>
+          <w:p>
+            <w:r>
+              <w:rPr>
+                <w:sz w:val="22"/>
+              </w:rPr>
+              <w:t>Mở Them → nạp danh mục → nhập thông tin, các tác giả và ảnh tùy chọn → POST có CSRF → kiểm tra biểu mẫu/trùng bộ → ghi sách và liên kết tác giả → trở về trang 1, tô sáng sách vừa lưu.</w:t>
+            </w:r>
+          </w:p>
+        </w:tc>
+      </w:tr>
+      <w:tr>
+        <w:tc>
+          <w:tcPr>
+            <w:tcW w:type="dxa" w:w="4677"/>
+          </w:tcPr>
+          <w:p>
+            <w:r>
+              <w:rPr>
+                <w:sz w:val="22"/>
+              </w:rPr>
+              <w:t>Hậu điều kiện</w:t>
+            </w:r>
+          </w:p>
+        </w:tc>
+        <w:tc>
+          <w:tcPr>
+            <w:tcW w:type="dxa" w:w="4677"/>
+          </w:tcPr>
+          <w:p>
+            <w:r>
+              <w:rPr>
+                <w:sz w:val="22"/>
+              </w:rPr>
+              <w:t>Nhân viên thêm: TrangThai=2, khách chưa thấy. Quản lý thêm: TrangThai=1. Mã, người tạo và trạng thái do máy chủ xác định.</w:t>
+            </w:r>
+          </w:p>
+        </w:tc>
+      </w:tr>
+      <w:tr>
+        <w:tc>
+          <w:tcPr>
+            <w:tcW w:type="dxa" w:w="4677"/>
+          </w:tcPr>
+          <w:p>
+            <w:r>
+              <w:rPr>
+                <w:sz w:val="22"/>
+              </w:rPr>
+              <w:t>Dữ liệu sai/trùng</w:t>
+            </w:r>
+          </w:p>
+        </w:tc>
+        <w:tc>
+          <w:tcPr>
+            <w:tcW w:type="dxa" w:w="4677"/>
+          </w:tcPr>
+          <w:p>
+            <w:r>
+              <w:rPr>
+                <w:sz w:val="22"/>
+              </w:rPr>
+              <w:t>Báo lỗi từng ô và giữ giá trị nhập; không tạo sách. So trùng cả tên, tập tác giả, NXB, năm, hình thức; khác tập tác giả được phép thêm.</w:t>
+            </w:r>
+          </w:p>
+        </w:tc>
+      </w:tr>
+      <w:tr>
+        <w:tc>
+          <w:tcPr>
+            <w:tcW w:type="dxa" w:w="4677"/>
+          </w:tcPr>
+          <w:p>
+            <w:r>
+              <w:rPr>
+                <w:sz w:val="22"/>
+              </w:rPr>
+              <w:t>Sửa/đổi giá</w:t>
+            </w:r>
+          </w:p>
+        </w:tc>
+        <w:tc>
+          <w:tcPr>
+            <w:tcW w:type="dxa" w:w="4677"/>
+          </w:tcPr>
+          <w:p>
+            <w:r>
+              <w:rPr>
+                <w:sz w:val="22"/>
+              </w:rPr>
+              <w:t>Mã sách lấy từ đường dẫn. Nhân viên đổi giá tạo/cập nhật đề xuất chờ duyệt, giữ giá bán cũ; quản lý đổi giá áp dụng ngay và ghi lịch sử. Đây là phần code của Hùng, chỉ đối chiếu để thống nhất UC12.</w:t>
+            </w:r>
+          </w:p>
+        </w:tc>
+      </w:tr>
+      <w:tr>
+        <w:tc>
+          <w:tcPr>
+            <w:tcW w:type="dxa" w:w="4677"/>
+          </w:tcPr>
+          <w:p>
+            <w:r>
+              <w:rPr>
+                <w:sz w:val="22"/>
+              </w:rPr>
+              <w:t>Ẩn/hiện, duyệt, xóa, khôi phục</w:t>
+            </w:r>
+          </w:p>
+        </w:tc>
+        <w:tc>
+          <w:tcPr>
+            <w:tcW w:type="dxa" w:w="4677"/>
+          </w:tcPr>
+          <w:p>
+            <w:r>
+              <w:rPr>
+                <w:sz w:val="22"/>
+              </w:rPr>
+              <w:t>Nội bộ được ẩn 1→0, hiện 0→1. Quản lý duyệt 2→1, xóa mềm 0/1/2→3, khôi phục 3→0. Có kiểm tra trạng thái/phiên bản để tránh cập nhật đè. Đây là phần code của Huy, không phải sản phẩm lập trình cá nhân Lâm.</w:t>
+            </w:r>
+          </w:p>
+        </w:tc>
+      </w:tr>
+      <w:tr>
+        <w:tc>
+          <w:tcPr>
+            <w:tcW w:type="dxa" w:w="4677"/>
+          </w:tcPr>
+          <w:p>
+            <w:r>
+              <w:rPr>
+                <w:sz w:val="22"/>
+              </w:rPr>
+              <w:t>Ngoại lệ quyền/ảnh</w:t>
+            </w:r>
+          </w:p>
+        </w:tc>
+        <w:tc>
+          <w:tcPr>
+            <w:tcW w:type="dxa" w:w="4677"/>
+          </w:tcPr>
+          <w:p>
+            <w:r>
+              <w:rPr>
+                <w:sz w:val="22"/>
+              </w:rPr>
+              <w:t>Khách bị chặn; thiếu CSRF trả lỗi. Ảnh không đúng đuôi/MIME hoặc &gt;2 MB bị từ chối; người dùng chọn lại ảnh sau lỗi. Lỗi đọc/ghi CSDL ngoài phạm vi bằng chứng InMemory phải được kiểm tra khi chạy SQL Server.</w:t>
+            </w:r>
+          </w:p>
+        </w:tc>
+      </w:tr>
+    </w:tbl>
+    <w:p/>
     <w:p>
       <w:pPr>
         <w:pStyle w:val="Heading1"/>
       </w:pPr>
       <w:r>
-        <w:t>5. Sản phẩm thẻ S4-L3</w:t>
-      </w:r>
-    </w:p>
-    <w:p>
-      <w:r>
-        <w:rPr>
-          <w:b w:val="0"/>
-        </w:rPr>
-        <w:t>Theo phân công, S4-L3 thuộc phần việc của Lê Hoàng Lâm. Trong hai gói không có tệp đặc tả hoặc bản vẽ màn hình được xác định là sản phẩm S4-L3. Các View Razor và ảnh kiểm thử thêm sách được trình bày ở mục 6 với đúng nguồn S4-L4, không dùng để chứng minh đã hoàn thành S4-L3.</w:t>
-      </w:r>
-    </w:p>
-    <w:p>
-      <w:r>
-        <w:rPr>
-          <w:b w:val="0"/>
-        </w:rPr>
-        <w:t>Trạng thái hồ sơ: chưa có sản phẩm S4-L3 để trích dẫn trong phạm vi hai gói được cung cấp. Báo cáo không xác nhận kết quả rà soát hoặc trạng thái Pass của thẻ này.</w:t>
-      </w:r>
-    </w:p>
-    <w:p>
-      <w:pPr>
-        <w:pStyle w:val="Heading1"/>
-      </w:pPr>
-      <w:r>
-        <w:t>6. Sản phẩm CSDL, lập trình và kiểm thử – S4-L2, S4-L4</w:t>
+        <w:t>6. Triển khai</w:t>
       </w:r>
     </w:p>
     <w:p>
@@ -454,7 +1062,7 @@
         <w:pStyle w:val="Heading2"/>
       </w:pPr>
       <w:r>
-        <w:t>6.1. S4-L2 – Script CSDL, Model và kết nối</w:t>
+        <w:t>S4-L2. Script CSDL, Model và kết nối</w:t>
       </w:r>
     </w:p>
     <w:p>
@@ -778,7 +1386,7 @@
         <w:pStyle w:val="Heading2"/>
       </w:pPr>
       <w:r>
-        <w:t>6.2. S4-L4 – Hoàn thiện chức năng thêm sách</w:t>
+        <w:t>S4-L4. Hoàn thiện chức năng thêm sách</w:t>
       </w:r>
     </w:p>
     <w:p>
@@ -1364,7 +1972,7 @@
         <w:drawing>
           <wp:inline xmlns:a="http://schemas.openxmlformats.org/drawingml/2006/main" xmlns:pic="http://schemas.openxmlformats.org/drawingml/2006/picture">
             <wp:extent cx="5760000" cy="4320000"/>
-            <wp:docPr id="1" name="Picture 1"/>
+            <wp:docPr id="2" name="Picture 2"/>
             <wp:cNvGraphicFramePr>
               <a:graphicFrameLocks noChangeAspect="1"/>
             </wp:cNvGraphicFramePr>
@@ -1376,7 +1984,7 @@
                     <pic:cNvPicPr/>
                   </pic:nvPicPr>
                   <pic:blipFill>
-                    <a:blip r:embed="rId10"/>
+                    <a:blip r:embed="rId11"/>
                     <a:srcRect b="51074"/>
                     <a:stretch>
                       <a:fillRect/>
@@ -1402,47 +2010,62 @@
         <w:keepNext/>
       </w:pPr>
       <w:r>
-        <w:t>Hình 6.1. Khách truy cập trang thêm sách bị chặn. (trích vùng đầu ảnh; ảnh đầy đủ trong gói mã nguồn)</w:t>
+        <w:t>Hình 2: Khách truy cập trang thêm sách bị chặn (trích vùng đầu ảnh; ảnh đầy đủ trong gói mã nguồn)</w:t>
       </w:r>
     </w:p>
     <w:p>
       <w:r>
         <w:rPr>
-          <w:b w:val="0"/>
+          <w:b/>
         </w:rPr>
-        <w:t>1. Tên và thẻ: Kiểm tra phân quyền mở trang thêm sách – S4-L4/TC10.</w:t>
+        <w:t xml:space="preserve">Mục đích: </w:t>
+      </w:r>
+      <w:r>
+        <w:t>Kiểm tra TC10: khách không được mở chức năng thêm sách nội bộ.</w:t>
       </w:r>
     </w:p>
     <w:p>
       <w:r>
         <w:rPr>
-          <w:b w:val="0"/>
+          <w:b/>
         </w:rPr>
-        <w:t>2. Mục đích: Ngăn vai khách tạo sách qua trang nội bộ.</w:t>
+        <w:t xml:space="preserve">Trạng thái ban đầu: </w:t>
+      </w:r>
+      <w:r>
+        <w:t>Session mặc định là khách; chưa có quyền nội bộ.</w:t>
       </w:r>
     </w:p>
     <w:p>
       <w:r>
         <w:rPr>
-          <w:b w:val="0"/>
+          <w:b/>
         </w:rPr>
-        <w:t>3. Nội dung: Trang trở về danh sách, hiển thị thông báo không có quyền.</w:t>
+        <w:t xml:space="preserve">Thao tác và dữ liệu nhập: </w:t>
+      </w:r>
+      <w:r>
+        <w:t>Mở /Sach/Them bằng Chromium, không nhập dữ liệu.</w:t>
       </w:r>
     </w:p>
     <w:p>
       <w:r>
         <w:rPr>
-          <w:b w:val="0"/>
+          <w:b/>
         </w:rPr>
-        <w:t>4. Cách thực hiện: Mở /Sach/Them trong Session mặc định của khách bằng Chromium.</w:t>
+        <w:t xml:space="preserve">Kết quả nhìn thấy: </w:t>
+      </w:r>
+      <w:r>
+        <w:t>Ứng dụng trở về danh sách và hiển thị thông báo không có quyền.</w:t>
       </w:r>
     </w:p>
     <w:p>
       <w:r>
         <w:rPr>
-          <w:b w:val="0"/>
+          <w:b/>
         </w:rPr>
-        <w:t>5. Kết quả và bằng chứng: Qua kiểm tra browser và HTTP GET/POST; ảnh do test host EF InMemory tạo, không phải SQL Server.</w:t>
+        <w:t xml:space="preserve">Nhận xét: </w:t>
+      </w:r>
+      <w:r>
+        <w:t>Phù hợp TC10. HTTP kiểm tra thêm cả POST của khách với CSRF hợp lệ. Ảnh được chụp từ test host InMemory, không chứng minh SQL Server đã hoạt động.</w:t>
       </w:r>
     </w:p>
     <w:p>
@@ -1453,7 +2076,7 @@
         <w:drawing>
           <wp:inline xmlns:a="http://schemas.openxmlformats.org/drawingml/2006/main" xmlns:pic="http://schemas.openxmlformats.org/drawingml/2006/picture">
             <wp:extent cx="5760000" cy="4320000"/>
-            <wp:docPr id="2" name="Picture 2"/>
+            <wp:docPr id="3" name="Picture 3"/>
             <wp:cNvGraphicFramePr>
               <a:graphicFrameLocks noChangeAspect="1"/>
             </wp:cNvGraphicFramePr>
@@ -1465,7 +2088,7 @@
                     <pic:cNvPicPr/>
                   </pic:nvPicPr>
                   <pic:blipFill>
-                    <a:blip r:embed="rId11"/>
+                    <a:blip r:embed="rId12"/>
                     <a:srcRect b="65022"/>
                     <a:stretch>
                       <a:fillRect/>
@@ -1491,47 +2114,62 @@
         <w:keepNext/>
       </w:pPr>
       <w:r>
-        <w:t>Hình 6.2. Sách nhân viên thêm ở đầu trang 1 và được tô sáng. (trích vùng đầu ảnh; ảnh đầy đủ trong gói mã nguồn)</w:t>
+        <w:t>Hình 3: Sách nhân viên thêm ở đầu trang 1 và được tô sáng (trích vùng đầu ảnh; ảnh đầy đủ trong gói mã nguồn)</w:t>
       </w:r>
     </w:p>
     <w:p>
       <w:r>
         <w:rPr>
-          <w:b w:val="0"/>
+          <w:b/>
         </w:rPr>
-        <w:t>1. Tên và thẻ: Thêm sách hợp lệ có nhiều tác giả và ảnh bìa – S4-L4/TC11.</w:t>
+        <w:t xml:space="preserve">Mục đích: </w:t>
+      </w:r>
+      <w:r>
+        <w:t>Kiểm tra TC11: thêm sách hợp lệ nhưng chờ quản lý duyệt.</w:t>
       </w:r>
     </w:p>
     <w:p>
       <w:r>
         <w:rPr>
-          <w:b w:val="0"/>
+          <w:b/>
         </w:rPr>
-        <w:t>2. Mục đích: Xác minh lưu thành công nhưng khách chưa thấy sách chờ duyệt.</w:t>
+        <w:t xml:space="preserve">Trạng thái ban đầu: </w:t>
+      </w:r>
+      <w:r>
+        <w:t>Đã chuyển Session sang Nhân viên; biểu mẫu thêm đang mở; danh mục dữ liệu kiểm thử tồn tại.</w:t>
       </w:r>
     </w:p>
     <w:p>
       <w:r>
         <w:rPr>
-          <w:b w:val="0"/>
+          <w:b/>
         </w:rPr>
-        <w:t>3. Nội dung: Dòng đầu có nền xanh, trạng thái Chờ quản lý duyệt; danh sách ở trang 1.</w:t>
+        <w:t xml:space="preserve">Thao tác và dữ liệu nhập: </w:t>
+      </w:r>
+      <w:r>
+        <w:t>Nhập tên sách kiểm thử, hai tác giả và một dòng trống; chọn NXB/thể loại, năm 2026, giá 99001 đồng, tải ảnh PNG rồi bấm Lưu sách.</w:t>
       </w:r>
     </w:p>
     <w:p>
       <w:r>
         <w:rPr>
-          <w:b w:val="0"/>
+          <w:b/>
         </w:rPr>
-        <w:t>4. Cách thực hiện: Đổi sang Nhân viên bằng nút ghi Session, nhập đủ trường, hai tác giả và một dòng trống; chọn ảnh rồi Lưu sách.</w:t>
+        <w:t xml:space="preserve">Kết quả nhìn thấy: </w:t>
+      </w:r>
+      <w:r>
+        <w:t>Trở về trang 1; sách mới đứng đầu bảng, tô xanh và mang trạng thái Chờ quản lý duyệt.</w:t>
       </w:r>
     </w:p>
     <w:p>
       <w:r>
         <w:rPr>
-          <w:b w:val="0"/>
+          <w:b/>
         </w:rPr>
-        <w:t>5. Kết quả và bằng chứng: Qua; giá 99001 được chấp nhận, bỏ tác giả rỗng/lặp. HTTP kiểm tra thêm mã/người tạo/trạng thái do server gán.</w:t>
+        <w:t xml:space="preserve">Nhận xét: </w:t>
+      </w:r>
+      <w:r>
+        <w:t>TC11 qua trên HTTP/Chromium; dòng tác giả rỗng/lặp được bỏ. HTTP còn xác minh ảnh lưu thật và server gán mã/người tạo/trạng thái. Chưa chạy kiểm tra ràng buộc SQL Server.</w:t>
       </w:r>
     </w:p>
     <w:p>
@@ -1542,7 +2180,7 @@
         <w:drawing>
           <wp:inline xmlns:a="http://schemas.openxmlformats.org/drawingml/2006/main" xmlns:pic="http://schemas.openxmlformats.org/drawingml/2006/picture">
             <wp:extent cx="5760000" cy="4212474"/>
-            <wp:docPr id="3" name="Picture 3"/>
+            <wp:docPr id="4" name="Picture 4"/>
             <wp:cNvGraphicFramePr>
               <a:graphicFrameLocks noChangeAspect="1"/>
             </wp:cNvGraphicFramePr>
@@ -1554,7 +2192,7 @@
                     <pic:cNvPicPr/>
                   </pic:nvPicPr>
                   <pic:blipFill>
-                    <a:blip r:embed="rId12"/>
+                    <a:blip r:embed="rId13"/>
                     <a:stretch>
                       <a:fillRect/>
                     </a:stretch>
@@ -1579,47 +2217,62 @@
         <w:keepNext/>
       </w:pPr>
       <w:r>
-        <w:t>Hình 6.3. Báo lỗi khi thêm sách trùng cả bộ.</w:t>
+        <w:t>Hình 4: Báo lỗi khi thêm sách trùng cả bộ</w:t>
       </w:r>
     </w:p>
     <w:p>
       <w:r>
         <w:rPr>
-          <w:b w:val="0"/>
+          <w:b/>
         </w:rPr>
-        <w:t>1. Tên và thẻ: Chống trùng sách – S4-L4/TC12.</w:t>
+        <w:t xml:space="preserve">Mục đích: </w:t>
+      </w:r>
+      <w:r>
+        <w:t>Kiểm tra TC12: không thêm lại cùng tên, tập tác giả, NXB, năm và hình thức.</w:t>
       </w:r>
     </w:p>
     <w:p>
       <w:r>
         <w:rPr>
-          <w:b w:val="0"/>
+          <w:b/>
         </w:rPr>
-        <w:t>2. Mục đích: Ngăn cùng một bộ tên, tác giả, NXB, năm và hình thức được tạo lại.</w:t>
+        <w:t xml:space="preserve">Trạng thái ban đầu: </w:t>
+      </w:r>
+      <w:r>
+        <w:t>Đang ở vai Nhân viên; bộ dữ liệu sách hợp lệ đã được tạo trước đó trong cùng test host.</w:t>
       </w:r>
     </w:p>
     <w:p>
       <w:r>
         <w:rPr>
-          <w:b w:val="0"/>
+          <w:b/>
         </w:rPr>
-        <w:t>3. Nội dung: Lỗi xuất hiện ở ô tên sách; các giá trị đã nhập vẫn có trên biểu mẫu.</w:t>
+        <w:t xml:space="preserve">Thao tác và dữ liệu nhập: </w:t>
+      </w:r>
+      <w:r>
+        <w:t>Nhập lại tên khác hoa/thường và có khoảng trắng; đảo thứ tự hai tác giả; giữ NXB, năm và hình thức.</w:t>
       </w:r>
     </w:p>
     <w:p>
       <w:r>
         <w:rPr>
-          <w:b w:val="0"/>
+          <w:b/>
         </w:rPr>
-        <w:t>4. Cách thực hiện: Nhập lại tên khác hoa/thường, có khoảng trắng và đảo thứ tự hai tác giả; giữ NXB/năm/hình thức.</w:t>
+        <w:t xml:space="preserve">Kết quả nhìn thấy: </w:t>
+      </w:r>
+      <w:r>
+        <w:t>Lỗi trùng xuất hiện ở ô Tên sách; biểu mẫu giữ dữ liệu đã nhập.</w:t>
       </w:r>
     </w:p>
     <w:p>
       <w:r>
         <w:rPr>
-          <w:b w:val="0"/>
+          <w:b/>
         </w:rPr>
-        <w:t>5. Kết quả và bằng chứng: Qua trên HTTP và browser. TC12b khác tập tác giả cũng qua trên HTTP: được phép thêm.</w:t>
+        <w:t xml:space="preserve">Nhận xét: </w:t>
+      </w:r>
+      <w:r>
+        <w:t>Qua trên HTTP và Chromium. TC12b khác tập tác giả được phép thêm trên HTTP. Helper K1 của master còn bỏ dấu; nhóm cần thống nhất cách chuẩn hóa cuối cùng.</w:t>
       </w:r>
     </w:p>
     <w:p>
@@ -1630,7 +2283,7 @@
         <w:drawing>
           <wp:inline xmlns:a="http://schemas.openxmlformats.org/drawingml/2006/main" xmlns:pic="http://schemas.openxmlformats.org/drawingml/2006/picture">
             <wp:extent cx="5760000" cy="4107057"/>
-            <wp:docPr id="4" name="Picture 4"/>
+            <wp:docPr id="5" name="Picture 5"/>
             <wp:cNvGraphicFramePr>
               <a:graphicFrameLocks noChangeAspect="1"/>
             </wp:cNvGraphicFramePr>
@@ -1642,7 +2295,7 @@
                     <pic:cNvPicPr/>
                   </pic:nvPicPr>
                   <pic:blipFill>
-                    <a:blip r:embed="rId13"/>
+                    <a:blip r:embed="rId14"/>
                     <a:stretch>
                       <a:fillRect/>
                     </a:stretch>
@@ -1667,47 +2320,62 @@
         <w:keepNext/>
       </w:pPr>
       <w:r>
-        <w:t>Hình 6.4. Lỗi từng trường và giữ dữ liệu đã nhập.</w:t>
+        <w:t>Hình 5: Báo lỗi từng trường và giữ dữ liệu nhập</w:t>
       </w:r>
     </w:p>
     <w:p>
       <w:r>
         <w:rPr>
-          <w:b w:val="0"/>
+          <w:b/>
         </w:rPr>
-        <w:t>1. Tên và thẻ: Kiểm tra biểu mẫu sai – S4-L4/TC13.</w:t>
+        <w:t xml:space="preserve">Mục đích: </w:t>
+      </w:r>
+      <w:r>
+        <w:t>Kiểm tra TC13: dữ liệu sai được chỉ rõ ở từng ô, dữ liệu hợp lệ không bị mất.</w:t>
       </w:r>
     </w:p>
     <w:p>
       <w:r>
         <w:rPr>
-          <w:b w:val="0"/>
+          <w:b/>
         </w:rPr>
-        <w:t>2. Mục đích: Hướng dẫn sửa từng ô mà không bắt nhập lại dữ liệu hợp lệ.</w:t>
+        <w:t xml:space="preserve">Trạng thái ban đầu: </w:t>
+      </w:r>
+      <w:r>
+        <w:t>Vai Nhân viên đang mở biểu mẫu thêm mới; đã nhập giá 99001 và chọn danh mục.</w:t>
       </w:r>
     </w:p>
     <w:p>
       <w:r>
         <w:rPr>
-          <w:b w:val="0"/>
+          <w:b/>
         </w:rPr>
-        <w:t>3. Nội dung: Lỗi ở tên, ISBN, tác giả; giá 99001 và danh mục đã chọn vẫn được giữ.</w:t>
+        <w:t xml:space="preserve">Thao tác và dữ liệu nhập: </w:t>
+      </w:r>
+      <w:r>
+        <w:t>Để trống tên/tác giả, nhập ISBN 12345 rồi gửi. Một lần submit của bài test bỏ client validation để kiểm tra đồng thời các lỗi server; không thay cấu hình validation của sản phẩm.</w:t>
       </w:r>
     </w:p>
     <w:p>
       <w:r>
         <w:rPr>
-          <w:b w:val="0"/>
+          <w:b/>
         </w:rPr>
-        <w:t>4. Cách thực hiện: Để trống tên/tác giả, ISBN 12345; một lần submit test bỏ client validation để kiểm tra đủ lỗi server. Mã sản phẩm không tắt validation.</w:t>
+        <w:t xml:space="preserve">Kết quả nhìn thấy: </w:t>
+      </w:r>
+      <w:r>
+        <w:t>Có lỗi ở tên, ISBN và tác giả; giá 99001 cùng danh mục đã chọn vẫn được giữ.</w:t>
       </w:r>
     </w:p>
     <w:p>
       <w:r>
         <w:rPr>
-          <w:b w:val="0"/>
+          <w:b/>
         </w:rPr>
-        <w:t>5. Kết quả và bằng chứng: Qua trên HTTP và Chromium; thêm kiểm tra raw input số sai, HTML encode, field errors. Ảnh mobile riêng nằm trong gói bàn giao.</w:t>
+        <w:t xml:space="preserve">Nhận xét: </w:t>
+      </w:r>
+      <w:r>
+        <w:t>Qua trên HTTP/Chromium. Có ảnh mobile riêng trong ZIP, không tràn ngang form. File ảnh phải chọn lại sau lỗi do giới hạn bảo mật của trình duyệt.</w:t>
       </w:r>
     </w:p>
     <w:tbl>
@@ -1993,7 +2661,7 @@
       <w:r>
         <w:t xml:space="preserve">Commit bàn giao ZIP thực tế trên kho tải tệp: </w:t>
       </w:r>
-      <w:hyperlink r:id="rId14">
+      <w:hyperlink r:id="rId15">
         <w:r>
           <w:rPr>
             <w:color w:val="0563C1"/>
@@ -2007,7 +2675,7 @@
       <w:r>
         <w:t xml:space="preserve">Tệp ZIP chứa mã, ảnh và nhật ký: </w:t>
       </w:r>
-      <w:hyperlink r:id="rId15">
+      <w:hyperlink r:id="rId16">
         <w:r>
           <w:rPr>
             <w:color w:val="0563C1"/>
@@ -2038,7 +2706,7 @@
         <w:pStyle w:val="Heading1"/>
       </w:pPr>
       <w:r>
-        <w:t>7. Mục 7</w:t>
+        <w:t>7. Kiểm thử</w:t>
       </w:r>
     </w:p>
     <w:p>
@@ -2054,7 +2722,7 @@
         <w:pStyle w:val="Heading1"/>
       </w:pPr>
       <w:r>
-        <w:t>8. Quá trình thực hiện</w:t>
+        <w:t>8. Quá trình thực hiện (Scrum)</w:t>
       </w:r>
     </w:p>
     <w:p>
@@ -2062,7 +2730,7 @@
         <w:pStyle w:val="Heading2"/>
       </w:pPr>
       <w:r>
-        <w:t>8.1. Tiếp nhận và đối chiếu đầu vào</w:t>
+        <w:t>S4-L1, S4-L2, S4-L3, S4-L4. Tiến độ và hồ sơ review</w:t>
       </w:r>
     </w:p>
     <w:p>
@@ -2070,23 +2738,7 @@
         <w:rPr>
           <w:b w:val="0"/>
         </w:rPr>
-        <w:t>Đầu vào gồm gói tonkho-lam.zip chứa bản tham khảo, S4-L2 v3, tài liệu nghiệp vụ và các script hỗ trợ; gói WebsiteBanSach-S4-L4.zip chứa bản mã nguồn đã tích hợp trên master, nhật ký AI, log và ảnh kiểm thử. Hai gói được kiểm tra lại trước khi lập báo cáo. Gói S4-L4 được xác nhận có cùng SHA-256 với bản bàn giao đã đưa lên kho tải tệp.</w:t>
-      </w:r>
-    </w:p>
-    <w:p>
-      <w:r>
-        <w:rPr>
-          <w:b w:val="0"/>
-        </w:rPr>
-        <w:t>Trong quá trình hỗ trợ trước khi đóng gói, mã tham khảo được phân biệt với master nhóm. Các chức năng sửa/chi tiết/duyệt/ẩn/xóa/khôi phục sẵn có được giữ nguyên, chỉ thay đổi những điểm nối cần để thêm sách hoạt động đúng.</w:t>
-      </w:r>
-    </w:p>
-    <w:p>
-      <w:pPr>
-        <w:pStyle w:val="Heading2"/>
-      </w:pPr>
-      <w:r>
-        <w:t>8.2. Các bước thực hiện và sản phẩm đầu ra</w:t>
+        <w:t>Bảng thời gian dùng đúng các cột mẫu 06. Hai ZIP và bản chung không có bình luận Trello xác nhận giờ thực tế của Lâm; các ô dưới ghi theo tình trạng hồ sơ, không sao chép giờ/Pass giả định trong ví dụ mẫu. Thời điểm đưa ZIP lên kho tải tệp không được dùng thay thời điểm nộp thẻ của nhóm.</w:t>
       </w:r>
     </w:p>
     <w:tbl>
@@ -2097,9 +2749,13 @@
         <w:tblLook w:firstColumn="1" w:firstRow="1" w:lastColumn="0" w:lastRow="0" w:noHBand="0" w:noVBand="1" w:val="04A0"/>
       </w:tblPr>
       <w:tblGrid>
-        <w:gridCol w:w="3118"/>
-        <w:gridCol w:w="3118"/>
-        <w:gridCol w:w="3118"/>
+        <w:gridCol w:w="1336"/>
+        <w:gridCol w:w="1336"/>
+        <w:gridCol w:w="1336"/>
+        <w:gridCol w:w="1336"/>
+        <w:gridCol w:w="1336"/>
+        <w:gridCol w:w="1336"/>
+        <w:gridCol w:w="1336"/>
       </w:tblGrid>
       <w:tr>
         <w:trPr>
@@ -2107,40 +2763,92 @@
         </w:trPr>
         <w:tc>
           <w:tcPr>
-            <w:tcW w:type="dxa" w:w="3118"/>
+            <w:tcW w:type="dxa" w:w="1336"/>
           </w:tcPr>
           <w:p>
             <w:r>
               <w:rPr>
-                <w:sz w:val="22"/>
+                <w:sz w:val="18"/>
               </w:rPr>
-              <w:t>Bước</w:t>
+              <w:t>Mã thẻ</w:t>
             </w:r>
           </w:p>
         </w:tc>
         <w:tc>
           <w:tcPr>
-            <w:tcW w:type="dxa" w:w="3118"/>
+            <w:tcW w:type="dxa" w:w="1336"/>
           </w:tcPr>
           <w:p>
             <w:r>
               <w:rPr>
-                <w:sz w:val="22"/>
+                <w:sz w:val="18"/>
               </w:rPr>
-              <w:t>Công việc đã có bằng chứng</w:t>
+              <w:t>Tên thẻ</w:t>
             </w:r>
           </w:p>
         </w:tc>
         <w:tc>
           <w:tcPr>
-            <w:tcW w:type="dxa" w:w="3118"/>
+            <w:tcW w:type="dxa" w:w="1336"/>
           </w:tcPr>
           <w:p>
             <w:r>
               <w:rPr>
-                <w:sz w:val="22"/>
+                <w:sz w:val="18"/>
               </w:rPr>
-              <w:t>Đầu ra</w:t>
+              <w:t>Hạn</w:t>
+            </w:r>
+          </w:p>
+        </w:tc>
+        <w:tc>
+          <w:tcPr>
+            <w:tcW w:type="dxa" w:w="1336"/>
+          </w:tcPr>
+          <w:p>
+            <w:r>
+              <w:rPr>
+                <w:sz w:val="18"/>
+              </w:rPr>
+              <w:t>Thời điểm nộp</w:t>
+            </w:r>
+          </w:p>
+        </w:tc>
+        <w:tc>
+          <w:tcPr>
+            <w:tcW w:type="dxa" w:w="1336"/>
+          </w:tcPr>
+          <w:p>
+            <w:r>
+              <w:rPr>
+                <w:sz w:val="18"/>
+              </w:rPr>
+              <w:t>Kết quả review</w:t>
+            </w:r>
+          </w:p>
+        </w:tc>
+        <w:tc>
+          <w:tcPr>
+            <w:tcW w:type="dxa" w:w="1336"/>
+          </w:tcPr>
+          <w:p>
+            <w:r>
+              <w:rPr>
+                <w:sz w:val="18"/>
+              </w:rPr>
+              <w:t>Giờ dự kiến</w:t>
+            </w:r>
+          </w:p>
+        </w:tc>
+        <w:tc>
+          <w:tcPr>
+            <w:tcW w:type="dxa" w:w="1336"/>
+          </w:tcPr>
+          <w:p>
+            <w:r>
+              <w:rPr>
+                <w:sz w:val="18"/>
+              </w:rPr>
+              <w:t>Giờ thực tế</w:t>
             </w:r>
           </w:p>
         </w:tc>
@@ -2148,40 +2856,92 @@
       <w:tr>
         <w:tc>
           <w:tcPr>
-            <w:tcW w:type="dxa" w:w="3118"/>
+            <w:tcW w:type="dxa" w:w="1336"/>
           </w:tcPr>
           <w:p>
             <w:r>
               <w:rPr>
-                <w:sz w:val="22"/>
+                <w:sz w:val="18"/>
               </w:rPr>
-              <w:t>1</w:t>
+              <w:t>S4-L1</w:t>
             </w:r>
           </w:p>
         </w:tc>
         <w:tc>
           <w:tcPr>
-            <w:tcW w:type="dxa" w:w="3118"/>
+            <w:tcW w:type="dxa" w:w="1336"/>
           </w:tcPr>
           <w:p>
             <w:r>
               <w:rPr>
-                <w:sz w:val="22"/>
+                <w:sz w:val="18"/>
               </w:rPr>
-              <w:t>Đọc schema, Model, kết nối và quy tắc TC10–TC13</w:t>
+              <w:t>Thiết kế CSDL theo 4 bước</w:t>
             </w:r>
           </w:p>
         </w:tc>
         <w:tc>
           <w:tcPr>
-            <w:tcW w:type="dxa" w:w="3118"/>
+            <w:tcW w:type="dxa" w:w="1336"/>
           </w:tcPr>
           <w:p>
             <w:r>
               <w:rPr>
-                <w:sz w:val="22"/>
+                <w:sz w:val="18"/>
               </w:rPr>
-              <w:t>Xác định dữ liệu, điều kiện hợp lệ và chống trùng cả bộ</w:t>
+              <w:t>Chưa có dữ liệu</w:t>
+            </w:r>
+          </w:p>
+        </w:tc>
+        <w:tc>
+          <w:tcPr>
+            <w:tcW w:type="dxa" w:w="1336"/>
+          </w:tcPr>
+          <w:p>
+            <w:r>
+              <w:rPr>
+                <w:sz w:val="18"/>
+              </w:rPr>
+              <w:t>Chưa có dữ liệu</w:t>
+            </w:r>
+          </w:p>
+        </w:tc>
+        <w:tc>
+          <w:tcPr>
+            <w:tcW w:type="dxa" w:w="1336"/>
+          </w:tcPr>
+          <w:p>
+            <w:r>
+              <w:rPr>
+                <w:sz w:val="18"/>
+              </w:rPr>
+              <w:t>Chưa có biên bản</w:t>
+            </w:r>
+          </w:p>
+        </w:tc>
+        <w:tc>
+          <w:tcPr>
+            <w:tcW w:type="dxa" w:w="1336"/>
+          </w:tcPr>
+          <w:p>
+            <w:r>
+              <w:rPr>
+                <w:sz w:val="18"/>
+              </w:rPr>
+              <w:t>Chưa có dữ liệu</w:t>
+            </w:r>
+          </w:p>
+        </w:tc>
+        <w:tc>
+          <w:tcPr>
+            <w:tcW w:type="dxa" w:w="1336"/>
+          </w:tcPr>
+          <w:p>
+            <w:r>
+              <w:rPr>
+                <w:sz w:val="18"/>
+              </w:rPr>
+              <w:t>Chưa có dữ liệu</w:t>
             </w:r>
           </w:p>
         </w:tc>
@@ -2189,40 +2949,92 @@
       <w:tr>
         <w:tc>
           <w:tcPr>
-            <w:tcW w:type="dxa" w:w="3118"/>
+            <w:tcW w:type="dxa" w:w="1336"/>
           </w:tcPr>
           <w:p>
             <w:r>
               <w:rPr>
-                <w:sz w:val="22"/>
+                <w:sz w:val="18"/>
               </w:rPr>
-              <w:t>2</w:t>
+              <w:t>S4-L2</w:t>
             </w:r>
           </w:p>
         </w:tc>
         <w:tc>
           <w:tcPr>
-            <w:tcW w:type="dxa" w:w="3118"/>
+            <w:tcW w:type="dxa" w:w="1336"/>
           </w:tcPr>
           <w:p>
             <w:r>
               <w:rPr>
-                <w:sz w:val="22"/>
+                <w:sz w:val="18"/>
               </w:rPr>
-              <w:t>Đối chiếu biểu mẫu thêm/sửa và tách phần _BieuMau</w:t>
+              <w:t>Script CSDL, Model, kết nối</w:t>
             </w:r>
           </w:p>
         </w:tc>
         <w:tc>
           <w:tcPr>
-            <w:tcW w:type="dxa" w:w="3118"/>
+            <w:tcW w:type="dxa" w:w="1336"/>
           </w:tcPr>
           <w:p>
             <w:r>
               <w:rPr>
-                <w:sz w:val="22"/>
+                <w:sz w:val="18"/>
               </w:rPr>
-              <w:t>Biểu mẫu chung có lỗi từng trường, nhiều tác giả và ảnh</w:t>
+              <w:t>Chưa có dữ liệu</w:t>
+            </w:r>
+          </w:p>
+        </w:tc>
+        <w:tc>
+          <w:tcPr>
+            <w:tcW w:type="dxa" w:w="1336"/>
+          </w:tcPr>
+          <w:p>
+            <w:r>
+              <w:rPr>
+                <w:sz w:val="18"/>
+              </w:rPr>
+              <w:t>Chưa có dữ liệu</w:t>
+            </w:r>
+          </w:p>
+        </w:tc>
+        <w:tc>
+          <w:tcPr>
+            <w:tcW w:type="dxa" w:w="1336"/>
+          </w:tcPr>
+          <w:p>
+            <w:r>
+              <w:rPr>
+                <w:sz w:val="18"/>
+              </w:rPr>
+              <w:t>Có gói v3; chưa có xác nhận review cuối</w:t>
+            </w:r>
+          </w:p>
+        </w:tc>
+        <w:tc>
+          <w:tcPr>
+            <w:tcW w:type="dxa" w:w="1336"/>
+          </w:tcPr>
+          <w:p>
+            <w:r>
+              <w:rPr>
+                <w:sz w:val="18"/>
+              </w:rPr>
+              <w:t>Chưa có dữ liệu</w:t>
+            </w:r>
+          </w:p>
+        </w:tc>
+        <w:tc>
+          <w:tcPr>
+            <w:tcW w:type="dxa" w:w="1336"/>
+          </w:tcPr>
+          <w:p>
+            <w:r>
+              <w:rPr>
+                <w:sz w:val="18"/>
+              </w:rPr>
+              <w:t>Chưa có dữ liệu</w:t>
             </w:r>
           </w:p>
         </w:tc>
@@ -2230,40 +3042,92 @@
       <w:tr>
         <w:tc>
           <w:tcPr>
-            <w:tcW w:type="dxa" w:w="3118"/>
+            <w:tcW w:type="dxa" w:w="1336"/>
           </w:tcPr>
           <w:p>
             <w:r>
               <w:rPr>
-                <w:sz w:val="22"/>
+                <w:sz w:val="18"/>
               </w:rPr>
-              <w:t>3</w:t>
+              <w:t>S4-L3</w:t>
             </w:r>
           </w:p>
         </w:tc>
         <w:tc>
           <w:tcPr>
-            <w:tcW w:type="dxa" w:w="3118"/>
+            <w:tcW w:type="dxa" w:w="1336"/>
           </w:tcPr>
           <w:p>
             <w:r>
               <w:rPr>
-                <w:sz w:val="22"/>
+                <w:sz w:val="18"/>
               </w:rPr>
-              <w:t>Ghép Them GET/POST vào master dùng Session</w:t>
+              <w:t>Bảng đặc tả UC12 quản lý sách</w:t>
             </w:r>
           </w:p>
         </w:tc>
         <w:tc>
           <w:tcPr>
-            <w:tcW w:type="dxa" w:w="3118"/>
+            <w:tcW w:type="dxa" w:w="1336"/>
           </w:tcPr>
           <w:p>
             <w:r>
               <w:rPr>
-                <w:sz w:val="22"/>
+                <w:sz w:val="18"/>
               </w:rPr>
-              <w:t>Sách nhân viên chờ duyệt, quản lý đang bán, không tin mã/trạng thái client</w:t>
+              <w:t>Chưa có dữ liệu</w:t>
+            </w:r>
+          </w:p>
+        </w:tc>
+        <w:tc>
+          <w:tcPr>
+            <w:tcW w:type="dxa" w:w="1336"/>
+          </w:tcPr>
+          <w:p>
+            <w:r>
+              <w:rPr>
+                <w:sz w:val="18"/>
+              </w:rPr>
+              <w:t>Chưa có dữ liệu</w:t>
+            </w:r>
+          </w:p>
+        </w:tc>
+        <w:tc>
+          <w:tcPr>
+            <w:tcW w:type="dxa" w:w="1336"/>
+          </w:tcPr>
+          <w:p>
+            <w:r>
+              <w:rPr>
+                <w:sz w:val="18"/>
+              </w:rPr>
+              <w:t>Chưa có bản đặc tả đã review</w:t>
+            </w:r>
+          </w:p>
+        </w:tc>
+        <w:tc>
+          <w:tcPr>
+            <w:tcW w:type="dxa" w:w="1336"/>
+          </w:tcPr>
+          <w:p>
+            <w:r>
+              <w:rPr>
+                <w:sz w:val="18"/>
+              </w:rPr>
+              <w:t>Chưa có dữ liệu</w:t>
+            </w:r>
+          </w:p>
+        </w:tc>
+        <w:tc>
+          <w:tcPr>
+            <w:tcW w:type="dxa" w:w="1336"/>
+          </w:tcPr>
+          <w:p>
+            <w:r>
+              <w:rPr>
+                <w:sz w:val="18"/>
+              </w:rPr>
+              <w:t>Chưa có dữ liệu</w:t>
             </w:r>
           </w:p>
         </w:tc>
@@ -2271,40 +3135,92 @@
       <w:tr>
         <w:tc>
           <w:tcPr>
-            <w:tcW w:type="dxa" w:w="3118"/>
+            <w:tcW w:type="dxa" w:w="1336"/>
           </w:tcPr>
           <w:p>
             <w:r>
               <w:rPr>
-                <w:sz w:val="22"/>
+                <w:sz w:val="18"/>
               </w:rPr>
-              <w:t>4</w:t>
+              <w:t>S4-L4</w:t>
             </w:r>
           </w:p>
         </w:tc>
         <w:tc>
           <w:tcPr>
-            <w:tcW w:type="dxa" w:w="3118"/>
+            <w:tcW w:type="dxa" w:w="1336"/>
           </w:tcPr>
           <w:p>
             <w:r>
               <w:rPr>
-                <w:sz w:val="22"/>
+                <w:sz w:val="18"/>
               </w:rPr>
-              <w:t>Sửa điểm nối đổi vai và danh sách</w:t>
+              <w:t>Lập trình thêm sách</w:t>
             </w:r>
           </w:p>
         </w:tc>
         <w:tc>
           <w:tcPr>
-            <w:tcW w:type="dxa" w:w="3118"/>
+            <w:tcW w:type="dxa" w:w="1336"/>
           </w:tcPr>
           <w:p>
             <w:r>
               <w:rPr>
-                <w:sz w:val="22"/>
+                <w:sz w:val="18"/>
               </w:rPr>
-              <w:t>Nút ghi Session thật; sách mới đầu trang 1, tô sáng</w:t>
+              <w:t>Chưa có dữ liệu</w:t>
+            </w:r>
+          </w:p>
+        </w:tc>
+        <w:tc>
+          <w:tcPr>
+            <w:tcW w:type="dxa" w:w="1336"/>
+          </w:tcPr>
+          <w:p>
+            <w:r>
+              <w:rPr>
+                <w:sz w:val="18"/>
+              </w:rPr>
+              <w:t>Chưa có dữ liệu</w:t>
+            </w:r>
+          </w:p>
+        </w:tc>
+        <w:tc>
+          <w:tcPr>
+            <w:tcW w:type="dxa" w:w="1336"/>
+          </w:tcPr>
+          <w:p>
+            <w:r>
+              <w:rPr>
+                <w:sz w:val="18"/>
+              </w:rPr>
+              <w:t>Có log tự kiểm tra; chưa có phiếu nhóm xác nhận</w:t>
+            </w:r>
+          </w:p>
+        </w:tc>
+        <w:tc>
+          <w:tcPr>
+            <w:tcW w:type="dxa" w:w="1336"/>
+          </w:tcPr>
+          <w:p>
+            <w:r>
+              <w:rPr>
+                <w:sz w:val="18"/>
+              </w:rPr>
+              <w:t>Chưa có dữ liệu</w:t>
+            </w:r>
+          </w:p>
+        </w:tc>
+        <w:tc>
+          <w:tcPr>
+            <w:tcW w:type="dxa" w:w="1336"/>
+          </w:tcPr>
+          <w:p>
+            <w:r>
+              <w:rPr>
+                <w:sz w:val="18"/>
+              </w:rPr>
+              <w:t>Chưa có dữ liệu</w:t>
             </w:r>
           </w:p>
         </w:tc>
@@ -2312,163 +3228,89 @@
       <w:tr>
         <w:tc>
           <w:tcPr>
-            <w:tcW w:type="dxa" w:w="3118"/>
+            <w:tcW w:type="dxa" w:w="1336"/>
           </w:tcPr>
           <w:p>
             <w:r>
               <w:rPr>
-                <w:sz w:val="22"/>
+                <w:sz w:val="18"/>
               </w:rPr>
-              <w:t>5</w:t>
+              <w:t>Tổng</w:t>
             </w:r>
           </w:p>
         </w:tc>
         <w:tc>
           <w:tcPr>
-            <w:tcW w:type="dxa" w:w="3118"/>
+            <w:tcW w:type="dxa" w:w="1336"/>
           </w:tcPr>
           <w:p>
             <w:r>
               <w:rPr>
-                <w:sz w:val="22"/>
+                <w:sz w:val="18"/>
               </w:rPr>
-              <w:t>Build Release và chạy kiểm thử HTTP</w:t>
             </w:r>
           </w:p>
         </w:tc>
         <w:tc>
           <w:tcPr>
-            <w:tcW w:type="dxa" w:w="3118"/>
+            <w:tcW w:type="dxa" w:w="1336"/>
           </w:tcPr>
           <w:p>
             <w:r>
               <w:rPr>
-                <w:sz w:val="22"/>
+                <w:sz w:val="18"/>
               </w:rPr>
-              <w:t>0 lỗi build; 38 kiểm tra HTTP qua bằng EF InMemory</w:t>
-            </w:r>
-          </w:p>
-        </w:tc>
-      </w:tr>
-      <w:tr>
-        <w:tc>
-          <w:tcPr>
-            <w:tcW w:type="dxa" w:w="3118"/>
-          </w:tcPr>
-          <w:p>
-            <w:r>
-              <w:rPr>
-                <w:sz w:val="22"/>
-              </w:rPr>
-              <w:t>6</w:t>
             </w:r>
           </w:p>
         </w:tc>
         <w:tc>
           <w:tcPr>
-            <w:tcW w:type="dxa" w:w="3118"/>
+            <w:tcW w:type="dxa" w:w="1336"/>
           </w:tcPr>
           <w:p>
             <w:r>
               <w:rPr>
-                <w:sz w:val="22"/>
+                <w:sz w:val="18"/>
               </w:rPr>
-              <w:t>Chạy Chromium desktop/mobile</w:t>
             </w:r>
           </w:p>
         </w:tc>
         <w:tc>
           <w:tcPr>
-            <w:tcW w:type="dxa" w:w="3118"/>
+            <w:tcW w:type="dxa" w:w="1336"/>
           </w:tcPr>
           <w:p>
             <w:r>
               <w:rPr>
-                <w:sz w:val="22"/>
+                <w:sz w:val="18"/>
               </w:rPr>
-              <w:t>10 kiểm tra qua, ảnh minh họa TC10–TC13</w:t>
-            </w:r>
-          </w:p>
-        </w:tc>
-      </w:tr>
-      <w:tr>
-        <w:tc>
-          <w:tcPr>
-            <w:tcW w:type="dxa" w:w="3118"/>
-          </w:tcPr>
-          <w:p>
-            <w:r>
-              <w:rPr>
-                <w:sz w:val="22"/>
-              </w:rPr>
-              <w:t>7</w:t>
+              <w:t>Chưa xác định số thẻ Pass</w:t>
             </w:r>
           </w:p>
         </w:tc>
         <w:tc>
           <w:tcPr>
-            <w:tcW w:type="dxa" w:w="3118"/>
+            <w:tcW w:type="dxa" w:w="1336"/>
           </w:tcPr>
           <w:p>
             <w:r>
               <w:rPr>
-                <w:sz w:val="22"/>
+                <w:sz w:val="18"/>
               </w:rPr>
-              <w:t>Ghi nhật ký, hướng dẫn và đóng gói</w:t>
+              <w:t>Không cộng khi thiếu dữ liệu</w:t>
             </w:r>
           </w:p>
         </w:tc>
         <w:tc>
           <w:tcPr>
-            <w:tcW w:type="dxa" w:w="3118"/>
+            <w:tcW w:type="dxa" w:w="1336"/>
           </w:tcPr>
           <w:p>
             <w:r>
               <w:rPr>
-                <w:sz w:val="22"/>
+                <w:sz w:val="18"/>
               </w:rPr>
-              <w:t>ZIP mã nguồn, patch, bằng chứng và log AI</w:t>
-            </w:r>
-          </w:p>
-        </w:tc>
-      </w:tr>
-      <w:tr>
-        <w:tc>
-          <w:tcPr>
-            <w:tcW w:type="dxa" w:w="3118"/>
-          </w:tcPr>
-          <w:p>
-            <w:r>
-              <w:rPr>
-                <w:sz w:val="22"/>
-              </w:rPr>
-              <w:t>8</w:t>
-            </w:r>
-          </w:p>
-        </w:tc>
-        <w:tc>
-          <w:tcPr>
-            <w:tcW w:type="dxa" w:w="3118"/>
-          </w:tcPr>
-          <w:p>
-            <w:r>
-              <w:rPr>
-                <w:sz w:val="22"/>
-              </w:rPr>
-              <w:t>Bàn giao qua kho đã được cấp quyền</w:t>
-            </w:r>
-          </w:p>
-        </w:tc>
-        <w:tc>
-          <w:tcPr>
-            <w:tcW w:type="dxa" w:w="3118"/>
-          </w:tcPr>
-          <w:p>
-            <w:r>
-              <w:rPr>
-                <w:sz w:val="22"/>
-              </w:rPr>
-              <w:t>ZIP ở nhánh ban-giao-s4-l4-20261019 của bom-NO2/chat_gpt</w:t>
+              <w:t>Không cộng khi thiếu dữ liệu</w:t>
             </w:r>
           </w:p>
         </w:tc>
@@ -2480,7 +3322,7 @@
         <w:pStyle w:val="Heading2"/>
       </w:pPr>
       <w:r>
-        <w:t>8.3. Thời gian và theo dõi thẻ</w:t>
+        <w:t>S4-L4. Quá trình phối hợp và xử lý khó khăn</w:t>
       </w:r>
     </w:p>
     <w:p>
@@ -2488,278 +3330,7 @@
         <w:rPr>
           <w:b w:val="0"/>
         </w:rPr>
-        <w:t>Ngày tổng hợp báo cáo: 19/10/2026. Hai gói không có bình luận Trello ghi giờ bắt đầu, giờ kết thúc hoặc thời lượng làm từng thẻ. Do đó, báo cáo ghi theo trình tự công việc và không điền giờ ước đoán. Ngày tạo tệp hoặc timestamp commit của công cụ không được sử dụng thay giờ thực hiện cá nhân trên Trello.</w:t>
-      </w:r>
-    </w:p>
-    <w:tbl>
-      <w:tblPr>
-        <w:tblStyle w:val="TableGrid"/>
-        <w:tblW w:type="auto" w:w="0"/>
-        <w:jc w:val="center"/>
-        <w:tblLook w:firstColumn="1" w:firstRow="1" w:lastColumn="0" w:lastRow="0" w:noHBand="0" w:noVBand="1" w:val="04A0"/>
-      </w:tblPr>
-      <w:tblGrid>
-        <w:gridCol w:w="3118"/>
-        <w:gridCol w:w="3118"/>
-        <w:gridCol w:w="3118"/>
-      </w:tblGrid>
-      <w:tr>
-        <w:trPr>
-          <w:tblHeader/>
-        </w:trPr>
-        <w:tc>
-          <w:tcPr>
-            <w:tcW w:type="dxa" w:w="3118"/>
-          </w:tcPr>
-          <w:p>
-            <w:r>
-              <w:rPr>
-                <w:sz w:val="22"/>
-              </w:rPr>
-              <w:t>Thẻ</w:t>
-            </w:r>
-          </w:p>
-        </w:tc>
-        <w:tc>
-          <w:tcPr>
-            <w:tcW w:type="dxa" w:w="3118"/>
-          </w:tcPr>
-          <w:p>
-            <w:r>
-              <w:rPr>
-                <w:sz w:val="22"/>
-              </w:rPr>
-              <w:t>Căn cứ quá trình trong hai gói</w:t>
-            </w:r>
-          </w:p>
-        </w:tc>
-        <w:tc>
-          <w:tcPr>
-            <w:tcW w:type="dxa" w:w="3118"/>
-          </w:tcPr>
-          <w:p>
-            <w:r>
-              <w:rPr>
-                <w:sz w:val="22"/>
-              </w:rPr>
-              <w:t>Giờ đối chiếu Trello</w:t>
-            </w:r>
-          </w:p>
-        </w:tc>
-      </w:tr>
-      <w:tr>
-        <w:tc>
-          <w:tcPr>
-            <w:tcW w:type="dxa" w:w="3118"/>
-          </w:tcPr>
-          <w:p>
-            <w:r>
-              <w:rPr>
-                <w:sz w:val="22"/>
-              </w:rPr>
-              <w:t>S4-L1</w:t>
-            </w:r>
-          </w:p>
-        </w:tc>
-        <w:tc>
-          <w:tcPr>
-            <w:tcW w:type="dxa" w:w="3118"/>
-          </w:tcPr>
-          <w:p>
-            <w:r>
-              <w:rPr>
-                <w:sz w:val="22"/>
-              </w:rPr>
-              <w:t>Không có sản phẩm nguồn của thẻ</w:t>
-            </w:r>
-          </w:p>
-        </w:tc>
-        <w:tc>
-          <w:tcPr>
-            <w:tcW w:type="dxa" w:w="3118"/>
-          </w:tcPr>
-          <w:p>
-            <w:r>
-              <w:rPr>
-                <w:sz w:val="22"/>
-              </w:rPr>
-              <w:t>Không có dữ liệu</w:t>
-            </w:r>
-          </w:p>
-        </w:tc>
-      </w:tr>
-      <w:tr>
-        <w:tc>
-          <w:tcPr>
-            <w:tcW w:type="dxa" w:w="3118"/>
-          </w:tcPr>
-          <w:p>
-            <w:r>
-              <w:rPr>
-                <w:sz w:val="22"/>
-              </w:rPr>
-              <w:t>S4-L3</w:t>
-            </w:r>
-          </w:p>
-        </w:tc>
-        <w:tc>
-          <w:tcPr>
-            <w:tcW w:type="dxa" w:w="3118"/>
-          </w:tcPr>
-          <w:p>
-            <w:r>
-              <w:rPr>
-                <w:sz w:val="22"/>
-              </w:rPr>
-              <w:t>Không có sản phẩm nguồn của thẻ</w:t>
-            </w:r>
-          </w:p>
-        </w:tc>
-        <w:tc>
-          <w:tcPr>
-            <w:tcW w:type="dxa" w:w="3118"/>
-          </w:tcPr>
-          <w:p>
-            <w:r>
-              <w:rPr>
-                <w:sz w:val="22"/>
-              </w:rPr>
-              <w:t>Không có dữ liệu</w:t>
-            </w:r>
-          </w:p>
-        </w:tc>
-      </w:tr>
-      <w:tr>
-        <w:tc>
-          <w:tcPr>
-            <w:tcW w:type="dxa" w:w="3118"/>
-          </w:tcPr>
-          <w:p>
-            <w:r>
-              <w:rPr>
-                <w:sz w:val="22"/>
-              </w:rPr>
-              <w:t>S4-L2</w:t>
-            </w:r>
-          </w:p>
-        </w:tc>
-        <w:tc>
-          <w:tcPr>
-            <w:tcW w:type="dxa" w:w="3118"/>
-          </w:tcPr>
-          <w:p>
-            <w:r>
-              <w:rPr>
-                <w:sz w:val="22"/>
-              </w:rPr>
-              <w:t>README, changelog v3 và lam-s4-l2.md</w:t>
-            </w:r>
-          </w:p>
-        </w:tc>
-        <w:tc>
-          <w:tcPr>
-            <w:tcW w:type="dxa" w:w="3118"/>
-          </w:tcPr>
-          <w:p>
-            <w:r>
-              <w:rPr>
-                <w:sz w:val="22"/>
-              </w:rPr>
-              <w:t>Không có dữ liệu</w:t>
-            </w:r>
-          </w:p>
-        </w:tc>
-      </w:tr>
-      <w:tr>
-        <w:tc>
-          <w:tcPr>
-            <w:tcW w:type="dxa" w:w="3118"/>
-          </w:tcPr>
-          <w:p>
-            <w:r>
-              <w:rPr>
-                <w:sz w:val="22"/>
-              </w:rPr>
-              <w:t>S4-L4</w:t>
-            </w:r>
-          </w:p>
-        </w:tc>
-        <w:tc>
-          <w:tcPr>
-            <w:tcW w:type="dxa" w:w="3118"/>
-          </w:tcPr>
-          <w:p>
-            <w:r>
-              <w:rPr>
-                <w:sz w:val="22"/>
-              </w:rPr>
-              <w:t>lam-s4-l4.md, log build/HTTP/browser và ảnh</w:t>
-            </w:r>
-          </w:p>
-        </w:tc>
-        <w:tc>
-          <w:tcPr>
-            <w:tcW w:type="dxa" w:w="3118"/>
-          </w:tcPr>
-          <w:p>
-            <w:r>
-              <w:rPr>
-                <w:sz w:val="22"/>
-              </w:rPr>
-              <w:t>Không có dữ liệu</w:t>
-            </w:r>
-          </w:p>
-        </w:tc>
-      </w:tr>
-      <w:tr>
-        <w:tc>
-          <w:tcPr>
-            <w:tcW w:type="dxa" w:w="3118"/>
-          </w:tcPr>
-          <w:p>
-            <w:r>
-              <w:rPr>
-                <w:sz w:val="22"/>
-              </w:rPr>
-              <w:t>S4-03</w:t>
-            </w:r>
-          </w:p>
-        </w:tc>
-        <w:tc>
-          <w:tcPr>
-            <w:tcW w:type="dxa" w:w="3118"/>
-          </w:tcPr>
-          <w:p>
-            <w:r>
-              <w:rPr>
-                <w:sz w:val="22"/>
-              </w:rPr>
-              <w:t>Nhật ký soạn báo cáo lam-s4-03.md</w:t>
-            </w:r>
-          </w:p>
-        </w:tc>
-        <w:tc>
-          <w:tcPr>
-            <w:tcW w:type="dxa" w:w="3118"/>
-          </w:tcPr>
-          <w:p>
-            <w:r>
-              <w:rPr>
-                <w:sz w:val="22"/>
-              </w:rPr>
-              <w:t>Không có dữ liệu</w:t>
-            </w:r>
-          </w:p>
-        </w:tc>
-      </w:tr>
-    </w:tbl>
-    <w:p/>
-    <w:p>
-      <w:pPr>
-        <w:pStyle w:val="Heading2"/>
-      </w:pPr>
-      <w:r>
-        <w:t>8.4. Khó khăn, xử lý và phối hợp</w:t>
+        <w:t>Đối chiếu mã tham khảo với master cho thấy bản cũ dùng cookie, master dùng Session; chức năng thêm và kiểm thử được ghép theo Session. Nút đổi vai ban đầu chỉ đổi localStorage và controller không có đuôi .cs nên đã sửa điểm nối, kiểm tra lại bằng HTTP/Chromium. _BieuMau được tách commit để Hùng lấy cho phần sửa; không sửa thân các action Sua và S4-Y4 sẵn có của nhóm.</w:t>
       </w:r>
     </w:p>
     <w:p>
@@ -2767,7 +3338,15 @@
         <w:rPr>
           <w:b w:val="0"/>
         </w:rPr>
-        <w:t>Khác biệt mã nguồn: bản tham khảo dùng cookie, master dùng Session. Khi tích hợp, chức năng thêm và bộ kiểm thử được điều chỉnh theo Session để khớp hệ thống hiện tại. File controller đổi vai ban đầu không có đuôi .cs; nút giao diện chỉ đổi localStorage nên chưa tác động quyền server. Hai điểm này đã được sửa và kiểm tra bằng HTTP/Chromium.</w:t>
+        <w:t>Build Release qua, 38 kiểm tra HTTP và 10 Chromium qua với InMemory. Tải SQL Server bị Forbidden nên chưa xác minh FK/index/decimal thật. Repository nhóm trả 403; theo sự đồng ý của người dùng, ZIP được đưa lên nhánh bàn giao riêng của bom-NO2/chat_gpt. Đây không thay cho PR vào WebsiteBanSach.</w:t>
+      </w:r>
+    </w:p>
+    <w:p>
+      <w:pPr>
+        <w:pStyle w:val="Heading2"/>
+      </w:pPr>
+      <w:r>
+        <w:t>S4-L2, S4-L4, S4-03. Sử dụng AI</w:t>
       </w:r>
     </w:p>
     <w:p>
@@ -2775,7 +3354,7 @@
         <w:rPr>
           <w:b w:val="0"/>
         </w:rPr>
-        <w:t>Phối hợp: _BieuMau.cshtml được tách commit để Hùng lấy riêng cho phần sửa sách. Không nhận phần xử lý sửa hoặc chi tiết của các thành viên khác thành sản phẩm cá nhân. Danh sách chỉ bổ sung phân trang tối thiểu và ưu tiên sách vừa lưu, không trình bày là đã làm toàn bộ bộ lọc/sắp xếp của S4-K3.</w:t>
+        <w:t>OpenAI Codex hỗ trợ đối chiếu mã, ghép S4-L4, viết test, tổng hợp sơ đồ/đặc tả từ mã và điền báo cáo theo mẫu 06. Gói S4-L2 v3 có nhật ký của công cụ AI đã dùng khi chuẩn bị gói đó; không coi là công việc được chạy lại trong phiên này.</w:t>
       </w:r>
     </w:p>
     <w:p>
@@ -2783,7 +3362,23 @@
         <w:rPr>
           <w:b w:val="0"/>
         </w:rPr>
-        <w:t>CSDL: gói L2 v3 dùng NhaSachOnline_S4, còn bản master đang dùng NhaSachOnline_S3. Bản tích hợp giữ cấu hình master; đây là khác biệt cần nhóm thống nhất khi triển khai. Việc tải image SQL Server bị Forbidden nên kết quả InMemory không được coi là kiểm chứng FK/index/decimal trên SQL Server thật.</w:t>
+        <w:t>Nhật ký: docs/prompt/lam-s4-l2.md trong gói L2; docs/prompt/lam-s4-l4.md trong gói S4-L4; docs/prompt/lam-s4-03.md cho báo cáo. Chưa có chỉnh sửa thủ công do Lâm cung cấp nên không ghi sửa của AI là phần Lâm tự sửa.</w:t>
+      </w:r>
+    </w:p>
+    <w:p>
+      <w:r>
+        <w:rPr>
+          <w:b/>
+        </w:rPr>
+        <w:t>Xác nhận tình trạng hồ sơ: báo cáo phân biệt phần được tổng hợp từ tài liệu/mã nguồn với phần có kết quả chạy thật; phần dùng AI đã ghi nguồn. Chưa có giờ Trello để xác nhận khớp, chưa ký thay người báo cáo và không tự xác nhận thẻ Pass.</w:t>
+      </w:r>
+    </w:p>
+    <w:p>
+      <w:r>
+        <w:rPr>
+          <w:b/>
+        </w:rPr>
+        <w:t>Nơi nhận:</w:t>
       </w:r>
     </w:p>
     <w:p>
@@ -2791,15 +3386,7 @@
         <w:rPr>
           <w:b w:val="0"/>
         </w:rPr>
-        <w:t>GitHub: repository nhóm từ chối truy cập 403; không thực hiện push hoặc tạo PR vào đó. Theo sự đồng ý của người dùng, tệp bàn giao được đưa vào nhánh riêng trên bom-NO2/chat_gpt để tải về; nhánh main không thay đổi. Đây là bàn giao tệp, không thay cho việc tích hợp PR của nhóm.</w:t>
-      </w:r>
-    </w:p>
-    <w:p>
-      <w:pPr>
-        <w:pStyle w:val="Heading2"/>
-      </w:pPr>
-      <w:r>
-        <w:t>8.5. Sử dụng AI và rà soát kết quả</w:t>
+        <w:t>- Nhóm trưởng (để gộp vào báo cáo chung);</w:t>
       </w:r>
     </w:p>
     <w:p>
@@ -2807,257 +3394,58 @@
         <w:rPr>
           <w:b w:val="0"/>
         </w:rPr>
-        <w:t>Gói S4-L2 v3 kèm nhật ký của công cụ AI đã dùng khi chuẩn bị sản phẩm đó. Trong phiên hỗ trợ này, OpenAI Codex giúp đối chiếu mã, ghép S4-L4, viết kiểm thử, ghi bằng chứng và tổng hợp báo cáo; không tự nhận công việc của công cụ khác là đã được thực hiện lại trong phiên.</w:t>
-      </w:r>
-    </w:p>
-    <w:p>
-      <w:r>
-        <w:rPr>
-          <w:b w:val="0"/>
-        </w:rPr>
-        <w:t>Các phần giữ lại, điều chỉnh và lý do được ghi tại docs/prompt/lam-s4-l2.md trong gói L2, docs/prompt/lam-s4-l4.md trong gói S4-L4, và docs/prompt/lam-s4-03.md cho báo cáo. Chưa có thay đổi thủ công của Lâm được cung cấp để ghi là phần tự sửa; không gán chỉnh sửa của AI thành chỉnh sửa cá nhân.</w:t>
-      </w:r>
-    </w:p>
-    <w:p>
-      <w:r>
-        <w:rPr>
-          <w:b w:val="0"/>
-        </w:rPr>
-        <w:t>Tự rà soát báo cáo: mỗi kết quả chạy được ghi đúng phạm vi; không dùng ảnh HTML mô phỏng làm bằng chứng SQL Server; không dùng SHA cục bộ làm link commit đã push; không ghi giờ Trello hoặc trạng thái Pass khi không có hồ sơ xác nhận.</w:t>
-      </w:r>
-    </w:p>
-    <w:p>
-      <w:pPr>
-        <w:pStyle w:val="Heading2"/>
-      </w:pPr>
-      <w:r>
-        <w:t>8.6. Danh mục tài liệu và bằng chứng</w:t>
+        <w:t>- Lưu: thư mục của người báo cáo.</w:t>
       </w:r>
     </w:p>
     <w:tbl>
       <w:tblPr>
-        <w:tblStyle w:val="TableGrid"/>
         <w:tblW w:type="auto" w:w="0"/>
-        <w:jc w:val="center"/>
         <w:tblLook w:firstColumn="1" w:firstRow="1" w:lastColumn="0" w:lastRow="0" w:noHBand="0" w:noVBand="1" w:val="04A0"/>
+        <w:tblBorders>
+          <w:top w:val="nil"/>
+          <w:left w:val="nil"/>
+          <w:bottom w:val="nil"/>
+          <w:right w:val="nil"/>
+          <w:insideH w:val="nil"/>
+          <w:insideV w:val="nil"/>
+        </w:tblBorders>
       </w:tblPr>
       <w:tblGrid>
         <w:gridCol w:w="4677"/>
         <w:gridCol w:w="4677"/>
       </w:tblGrid>
       <w:tr>
-        <w:trPr>
-          <w:tblHeader/>
-        </w:trPr>
         <w:tc>
           <w:tcPr>
             <w:tcW w:type="dxa" w:w="4677"/>
           </w:tcPr>
-          <w:p>
-            <w:r>
-              <w:rPr>
-                <w:sz w:val="22"/>
-              </w:rPr>
-              <w:t>Nguồn</w:t>
-            </w:r>
-          </w:p>
+          <w:p/>
         </w:tc>
         <w:tc>
           <w:tcPr>
             <w:tcW w:type="dxa" w:w="4677"/>
           </w:tcPr>
           <w:p>
+            <w:pPr>
+              <w:jc w:val="center"/>
+            </w:pPr>
             <w:r>
-              <w:rPr>
-                <w:sz w:val="22"/>
-              </w:rPr>
-              <w:t>Nội dung sử dụng</w:t>
-            </w:r>
-          </w:p>
-        </w:tc>
-      </w:tr>
-      <w:tr>
-        <w:tc>
-          <w:tcPr>
-            <w:tcW w:type="dxa" w:w="4677"/>
-          </w:tcPr>
-          <w:p>
-            <w:r>
-              <w:rPr>
-                <w:sz w:val="22"/>
-              </w:rPr>
-              <w:t>tonkho-lam.zip/02-S4-L2-v3-deliverable</w:t>
-            </w:r>
-          </w:p>
-        </w:tc>
-        <w:tc>
-          <w:tcPr>
-            <w:tcW w:type="dxa" w:w="4677"/>
-          </w:tcPr>
-          <w:p>
-            <w:r>
-              <w:rPr>
-                <w:sz w:val="22"/>
-              </w:rPr>
-              <w:t>SQL, Model, kết nối, README, changelog và nhật ký L2</w:t>
-            </w:r>
-          </w:p>
-        </w:tc>
-      </w:tr>
-      <w:tr>
-        <w:tc>
-          <w:tcPr>
-            <w:tcW w:type="dxa" w:w="4677"/>
-          </w:tcPr>
-          <w:p>
-            <w:r>
-              <w:rPr>
-                <w:sz w:val="22"/>
-              </w:rPr>
-              <w:t>tonkho-lam.zip/06-QUY-TAC-VA-TC10-13.md</w:t>
-            </w:r>
-          </w:p>
-        </w:tc>
-        <w:tc>
-          <w:tcPr>
-            <w:tcW w:type="dxa" w:w="4677"/>
-          </w:tcPr>
-          <w:p>
-            <w:r>
-              <w:rPr>
-                <w:sz w:val="22"/>
-              </w:rPr>
-              <w:t>Quy tắc nghiệp vụ và kỳ vọng TC10–TC13</w:t>
-            </w:r>
-          </w:p>
-        </w:tc>
-      </w:tr>
-      <w:tr>
-        <w:tc>
-          <w:tcPr>
-            <w:tcW w:type="dxa" w:w="4677"/>
-          </w:tcPr>
-          <w:p>
-            <w:r>
-              <w:rPr>
-                <w:sz w:val="22"/>
-              </w:rPr>
-              <w:t>WebsiteBanSach-S4-L4.zip/NhaSachOnline</w:t>
-            </w:r>
-          </w:p>
-        </w:tc>
-        <w:tc>
-          <w:tcPr>
-            <w:tcW w:type="dxa" w:w="4677"/>
-          </w:tcPr>
-          <w:p>
-            <w:r>
-              <w:rPr>
-                <w:sz w:val="22"/>
-              </w:rPr>
-              <w:t>Mã nguồn thêm sách và điểm nối với master</w:t>
-            </w:r>
-          </w:p>
-        </w:tc>
-      </w:tr>
-      <w:tr>
-        <w:tc>
-          <w:tcPr>
-            <w:tcW w:type="dxa" w:w="4677"/>
-          </w:tcPr>
-          <w:p>
-            <w:r>
-              <w:rPr>
-                <w:sz w:val="22"/>
-              </w:rPr>
-              <w:t>WebsiteBanSach-S4-L4.zip/docs/S4-L4/evidence</w:t>
-            </w:r>
-          </w:p>
-        </w:tc>
-        <w:tc>
-          <w:tcPr>
-            <w:tcW w:type="dxa" w:w="4677"/>
-          </w:tcPr>
-          <w:p>
-            <w:r>
-              <w:rPr>
-                <w:sz w:val="22"/>
-              </w:rPr>
-              <w:t>Kết quả build Release, HTTP, Chromium, trở ngại bên ngoài</w:t>
-            </w:r>
-          </w:p>
-        </w:tc>
-      </w:tr>
-      <w:tr>
-        <w:tc>
-          <w:tcPr>
-            <w:tcW w:type="dxa" w:w="4677"/>
-          </w:tcPr>
-          <w:p>
-            <w:r>
-              <w:rPr>
-                <w:sz w:val="22"/>
-              </w:rPr>
-              <w:t>WebsiteBanSach-S4-L4.zip/docs/S4-L4/screenshots</w:t>
-            </w:r>
-          </w:p>
-        </w:tc>
-        <w:tc>
-          <w:tcPr>
-            <w:tcW w:type="dxa" w:w="4677"/>
-          </w:tcPr>
-          <w:p>
-            <w:r>
-              <w:rPr>
-                <w:sz w:val="22"/>
-              </w:rPr>
-              <w:t>Ảnh thật của test host cho TC10–TC13</w:t>
-            </w:r>
-          </w:p>
-        </w:tc>
-      </w:tr>
-      <w:tr>
-        <w:tc>
-          <w:tcPr>
-            <w:tcW w:type="dxa" w:w="4677"/>
-          </w:tcPr>
-          <w:p>
-            <w:r>
-              <w:rPr>
-                <w:sz w:val="22"/>
-              </w:rPr>
-              <w:t>WebsiteBanSach-S4-L4.zip/docs/prompt/lam-s4-l4.md</w:t>
-            </w:r>
-          </w:p>
-        </w:tc>
-        <w:tc>
-          <w:tcPr>
-            <w:tcW w:type="dxa" w:w="4677"/>
-          </w:tcPr>
-          <w:p>
-            <w:r>
-              <w:rPr>
-                <w:sz w:val="22"/>
-              </w:rPr>
-              <w:t>Nhật ký sử dụng AI và phạm vi tích hợp</w:t>
+              <w:t>NGƯỜI BÁO CÁO</w:t>
+              <w:br/>
+              <w:t>(Ký, ghi rõ họ tên sau khi rà soát)</w:t>
+              <w:br/>
+              <w:br/>
+              <w:br/>
+              <w:t>Lê Hoàng Lâm</w:t>
             </w:r>
           </w:p>
         </w:tc>
       </w:tr>
     </w:tbl>
-    <w:p/>
-    <w:p>
-      <w:r>
-        <w:rPr>
-          <w:b w:val="0"/>
-        </w:rPr>
-        <w:t>Báo cáo phản ánh các sản phẩm và bằng chứng có trong hai gói đầu vào. Hồ sơ hiện chưa chứng minh sản phẩm S4-L1/S4-L3, giờ Trello, phiếu kiểm thử có người xác nhận hoặc PR đã được nhóm gộp; các nội dung đó không được suy diễn từ kết quả tự động S4-L4.</w:t>
-      </w:r>
-    </w:p>
     <w:sectPr>
       <w:footerReference w:type="default" r:id="rId9"/>
       <w:pgSz w:w="11906" w:h="16838"/>
-      <w:pgMar w:top="1134" w:right="1134" w:bottom="1134" w:left="1417" w:header="720" w:footer="720" w:gutter="0"/>
+      <w:pgMar w:top="1134" w:right="850" w:bottom="1134" w:left="1701" w:header="720" w:footer="720" w:gutter="0"/>
       <w:cols w:space="720"/>
       <w:docGrid w:linePitch="360"/>
     </w:sectPr>
@@ -3444,10 +3832,10 @@
     <w:qFormat/>
     <w:rsid w:val="00FC693F"/>
     <w:pPr>
-      <w:spacing w:line="276" w:lineRule="auto" w:after="120"/>
+      <w:spacing w:after="120" w:line="276" w:lineRule="auto"/>
     </w:pPr>
     <w:rPr>
-      <w:rFonts w:ascii="Times New Roman" w:hAnsi="Times New Roman"/>
+      <w:rFonts w:ascii="Times New Roman" w:hAnsi="Times New Roman" w:eastAsia="Times New Roman"/>
       <w:sz w:val="26"/>
     </w:rPr>
   </w:style>
@@ -3513,8 +3901,8 @@
       <w:rFonts w:asciiTheme="majorHAnsi" w:eastAsiaTheme="majorEastAsia" w:hAnsiTheme="majorHAnsi" w:cstheme="majorBidi" w:ascii="Times New Roman" w:hAnsi="Times New Roman"/>
       <w:b/>
       <w:bCs/>
-      <w:color w:val="17365D"/>
-      <w:sz w:val="32"/>
+      <w:color w:val="000000"/>
+      <w:sz w:val="26"/>
       <w:szCs w:val="28"/>
     </w:rPr>
   </w:style>
@@ -3537,8 +3925,8 @@
       <w:rFonts w:asciiTheme="majorHAnsi" w:eastAsiaTheme="majorEastAsia" w:hAnsiTheme="majorHAnsi" w:cstheme="majorBidi" w:ascii="Times New Roman" w:hAnsi="Times New Roman"/>
       <w:b/>
       <w:bCs/>
-      <w:color w:val="17365D"/>
-      <w:sz w:val="28"/>
+      <w:color w:val="000000"/>
+      <w:sz w:val="26"/>
       <w:szCs w:val="26"/>
     </w:rPr>
   </w:style>
@@ -3561,7 +3949,8 @@
       <w:rFonts w:asciiTheme="majorHAnsi" w:eastAsiaTheme="majorEastAsia" w:hAnsiTheme="majorHAnsi" w:cstheme="majorBidi" w:ascii="Times New Roman" w:hAnsi="Times New Roman"/>
       <w:b/>
       <w:bCs/>
-      <w:color w:val="17365D"/>
+      <w:color w:val="000000"/>
+      <w:sz w:val="26"/>
     </w:rPr>
   </w:style>
   <w:style w:type="paragraph" w:styleId="Heading4">
@@ -3800,7 +4189,7 @@
     </w:pPr>
     <w:rPr>
       <w:rFonts w:asciiTheme="majorHAnsi" w:eastAsiaTheme="majorEastAsia" w:hAnsiTheme="majorHAnsi" w:cstheme="majorBidi" w:ascii="Times New Roman" w:hAnsi="Times New Roman"/>
-      <w:color w:val="17365D"/>
+      <w:color w:val="000000"/>
       <w:spacing w:val="5"/>
       <w:kern w:val="28"/>
       <w:sz w:val="52"/>

</xml_diff>